<commit_message>
Adding Elasticsearch with Python notes, adding Jest notes, and adding search topics and links to search notes
</commit_message>
<xml_diff>
--- a/Jest/Jest-Typescript-Notes/Jest-Typescript-Notes-01.docx
+++ b/Jest/Jest-Typescript-Notes/Jest-Typescript-Notes-01.docx
@@ -5,7 +5,7 @@
     <w:p>
       <w:pPr>
         <w:rPr>
-          <w:rFonts w:ascii="Sakkal Majalla" w:hAnsi="Sakkal Majalla" w:cs="Sakkal Majalla" w:hint="cs"/>
+          <w:rFonts w:ascii="Sakkal Majalla" w:hAnsi="Sakkal Majalla" w:cs="Sakkal Majalla"/>
         </w:rPr>
       </w:pPr>
       <w:r>
@@ -1623,12 +1623,2698 @@
       <w:pPr>
         <w:shd w:val="clear" w:color="auto" w:fill="FFFFFF"/>
         <w:spacing w:after="0" w:line="285" w:lineRule="atLeast"/>
+        <w:ind w:left="1440" w:firstLine="720"/>
+        <w:rPr>
+          <w:rFonts w:ascii="Sakkal Majalla" w:eastAsia="Times New Roman" w:hAnsi="Sakkal Majalla" w:cs="Sakkal Majalla"/>
+          <w:color w:val="202020"/>
+          <w:kern w:val="0"/>
+          <w14:ligatures w14:val="none"/>
+        </w:rPr>
+      </w:pPr>
+      <w:r>
         <w:rPr>
           <w:rFonts w:ascii="Sakkal Majalla" w:eastAsia="Times New Roman" w:hAnsi="Sakkal Majalla" w:cs="Sakkal Majalla" w:hint="cs"/>
           <w:color w:val="202020"/>
           <w:kern w:val="0"/>
           <w14:ligatures w14:val="none"/>
         </w:rPr>
+        <w:t>====================================================</w:t>
+      </w:r>
+    </w:p>
+    <w:p>
+      <w:pPr>
+        <w:shd w:val="clear" w:color="auto" w:fill="FFFFFF"/>
+        <w:spacing w:after="0" w:line="285" w:lineRule="atLeast"/>
+        <w:rPr>
+          <w:rFonts w:ascii="Sakkal Majalla" w:eastAsia="Times New Roman" w:hAnsi="Sakkal Majalla" w:cs="Sakkal Majalla"/>
+          <w:color w:val="202020"/>
+          <w:kern w:val="0"/>
+          <w14:ligatures w14:val="none"/>
+        </w:rPr>
+      </w:pPr>
+    </w:p>
+    <w:p>
+      <w:pPr>
+        <w:shd w:val="clear" w:color="auto" w:fill="FFFFFF"/>
+        <w:spacing w:after="0" w:line="285" w:lineRule="atLeast"/>
+        <w:rPr>
+          <w:rFonts w:ascii="Sakkal Majalla" w:eastAsia="Times New Roman" w:hAnsi="Sakkal Majalla" w:cs="Sakkal Majalla"/>
+          <w:color w:val="202020"/>
+          <w:kern w:val="0"/>
+          <w14:ligatures w14:val="none"/>
+        </w:rPr>
+      </w:pPr>
+    </w:p>
+    <w:p>
+      <w:pPr>
+        <w:shd w:val="clear" w:color="auto" w:fill="FFFFFF"/>
+        <w:spacing w:after="0" w:line="285" w:lineRule="atLeast"/>
+        <w:rPr>
+          <w:rFonts w:ascii="Sakkal Majalla" w:eastAsia="Times New Roman" w:hAnsi="Sakkal Majalla" w:cs="Sakkal Majalla"/>
+          <w:color w:val="202020"/>
+          <w:kern w:val="0"/>
+          <w14:ligatures w14:val="none"/>
+        </w:rPr>
+      </w:pPr>
+    </w:p>
+    <w:p>
+      <w:pPr>
+        <w:shd w:val="clear" w:color="auto" w:fill="FFFFFF"/>
+        <w:spacing w:after="0" w:line="285" w:lineRule="atLeast"/>
+        <w:rPr>
+          <w:rFonts w:ascii="Sakkal Majalla" w:eastAsia="Times New Roman" w:hAnsi="Sakkal Majalla" w:cs="Sakkal Majalla"/>
+          <w:color w:val="202020"/>
+          <w:kern w:val="0"/>
+          <w14:ligatures w14:val="none"/>
+        </w:rPr>
+      </w:pPr>
+    </w:p>
+    <w:p>
+      <w:pPr>
+        <w:shd w:val="clear" w:color="auto" w:fill="FFFFFF"/>
+        <w:spacing w:after="0" w:line="285" w:lineRule="atLeast"/>
+        <w:rPr>
+          <w:rFonts w:ascii="Sakkal Majalla" w:eastAsia="Times New Roman" w:hAnsi="Sakkal Majalla" w:cs="Sakkal Majalla"/>
+          <w:color w:val="202020"/>
+          <w:kern w:val="0"/>
+          <w14:ligatures w14:val="none"/>
+        </w:rPr>
+      </w:pPr>
+    </w:p>
+    <w:p>
+      <w:pPr>
+        <w:shd w:val="clear" w:color="auto" w:fill="FFFFFF"/>
+        <w:spacing w:after="0" w:line="285" w:lineRule="atLeast"/>
+        <w:rPr>
+          <w:rFonts w:ascii="Sakkal Majalla" w:eastAsia="Times New Roman" w:hAnsi="Sakkal Majalla" w:cs="Sakkal Majalla"/>
+          <w:color w:val="202020"/>
+          <w:kern w:val="0"/>
+          <w14:ligatures w14:val="none"/>
+        </w:rPr>
+      </w:pPr>
+    </w:p>
+    <w:p>
+      <w:pPr>
+        <w:shd w:val="clear" w:color="auto" w:fill="FFFFFF"/>
+        <w:spacing w:after="0" w:line="285" w:lineRule="atLeast"/>
+        <w:rPr>
+          <w:rFonts w:ascii="Sakkal Majalla" w:eastAsia="Times New Roman" w:hAnsi="Sakkal Majalla" w:cs="Sakkal Majalla"/>
+          <w:color w:val="202020"/>
+          <w:kern w:val="0"/>
+          <w14:ligatures w14:val="none"/>
+        </w:rPr>
+      </w:pPr>
+    </w:p>
+    <w:p>
+      <w:pPr>
+        <w:shd w:val="clear" w:color="auto" w:fill="FFFFFF"/>
+        <w:spacing w:after="0" w:line="285" w:lineRule="atLeast"/>
+        <w:rPr>
+          <w:rFonts w:ascii="Sakkal Majalla" w:eastAsia="Times New Roman" w:hAnsi="Sakkal Majalla" w:cs="Sakkal Majalla"/>
+          <w:color w:val="202020"/>
+          <w:kern w:val="0"/>
+          <w14:ligatures w14:val="none"/>
+        </w:rPr>
+      </w:pPr>
+    </w:p>
+    <w:p>
+      <w:pPr>
+        <w:shd w:val="clear" w:color="auto" w:fill="FFFFFF"/>
+        <w:spacing w:after="0" w:line="285" w:lineRule="atLeast"/>
+        <w:rPr>
+          <w:rFonts w:ascii="Sakkal Majalla" w:eastAsia="Times New Roman" w:hAnsi="Sakkal Majalla" w:cs="Sakkal Majalla"/>
+          <w:color w:val="202020"/>
+          <w:kern w:val="0"/>
+          <w14:ligatures w14:val="none"/>
+        </w:rPr>
+      </w:pPr>
+    </w:p>
+    <w:p>
+      <w:pPr>
+        <w:shd w:val="clear" w:color="auto" w:fill="FFFFFF"/>
+        <w:spacing w:after="0" w:line="285" w:lineRule="atLeast"/>
+        <w:rPr>
+          <w:rFonts w:ascii="Sakkal Majalla" w:eastAsia="Times New Roman" w:hAnsi="Sakkal Majalla" w:cs="Sakkal Majalla"/>
+          <w:color w:val="202020"/>
+          <w:kern w:val="0"/>
+          <w14:ligatures w14:val="none"/>
+        </w:rPr>
+      </w:pPr>
+    </w:p>
+    <w:p>
+      <w:pPr>
+        <w:shd w:val="clear" w:color="auto" w:fill="FFFFFF"/>
+        <w:spacing w:after="0" w:line="285" w:lineRule="atLeast"/>
+        <w:rPr>
+          <w:rFonts w:ascii="Sakkal Majalla" w:eastAsia="Times New Roman" w:hAnsi="Sakkal Majalla" w:cs="Sakkal Majalla"/>
+          <w:color w:val="202020"/>
+          <w:kern w:val="0"/>
+          <w14:ligatures w14:val="none"/>
+        </w:rPr>
+      </w:pPr>
+    </w:p>
+    <w:p>
+      <w:pPr>
+        <w:shd w:val="clear" w:color="auto" w:fill="FFFFFF"/>
+        <w:spacing w:after="0" w:line="285" w:lineRule="atLeast"/>
+        <w:rPr>
+          <w:rFonts w:ascii="Sakkal Majalla" w:eastAsia="Times New Roman" w:hAnsi="Sakkal Majalla" w:cs="Sakkal Majalla"/>
+          <w:color w:val="202020"/>
+          <w:kern w:val="0"/>
+          <w14:ligatures w14:val="none"/>
+        </w:rPr>
+      </w:pPr>
+    </w:p>
+    <w:p>
+      <w:pPr>
+        <w:shd w:val="clear" w:color="auto" w:fill="FFFFFF"/>
+        <w:spacing w:after="0" w:line="285" w:lineRule="atLeast"/>
+        <w:rPr>
+          <w:rFonts w:ascii="Sakkal Majalla" w:eastAsia="Times New Roman" w:hAnsi="Sakkal Majalla" w:cs="Sakkal Majalla"/>
+          <w:color w:val="202020"/>
+          <w:kern w:val="0"/>
+          <w14:ligatures w14:val="none"/>
+        </w:rPr>
+      </w:pPr>
+    </w:p>
+    <w:p>
+      <w:pPr>
+        <w:shd w:val="clear" w:color="auto" w:fill="FFFFFF"/>
+        <w:spacing w:after="0" w:line="285" w:lineRule="atLeast"/>
+        <w:rPr>
+          <w:rFonts w:ascii="Sakkal Majalla" w:eastAsia="Times New Roman" w:hAnsi="Sakkal Majalla" w:cs="Sakkal Majalla"/>
+          <w:color w:val="202020"/>
+          <w:kern w:val="0"/>
+          <w14:ligatures w14:val="none"/>
+        </w:rPr>
+      </w:pPr>
+      <w:r>
+        <w:rPr>
+          <w:rFonts w:ascii="Sakkal Majalla" w:eastAsia="Times New Roman" w:hAnsi="Sakkal Majalla" w:cs="Sakkal Majalla"/>
+          <w:color w:val="202020"/>
+          <w:kern w:val="0"/>
+          <w14:ligatures w14:val="none"/>
+        </w:rPr>
+        <w:lastRenderedPageBreak/>
+        <w:t>The function to test is:</w:t>
+      </w:r>
+    </w:p>
+    <w:p>
+      <w:pPr>
+        <w:shd w:val="clear" w:color="auto" w:fill="FFFFFF"/>
+        <w:spacing w:after="0" w:line="285" w:lineRule="atLeast"/>
+        <w:rPr>
+          <w:rFonts w:ascii="Consolas" w:eastAsia="Times New Roman" w:hAnsi="Consolas" w:cs="Times New Roman"/>
+          <w:color w:val="202020"/>
+          <w:kern w:val="0"/>
+          <w:sz w:val="21"/>
+          <w:szCs w:val="21"/>
+          <w14:ligatures w14:val="none"/>
+        </w:rPr>
+      </w:pPr>
+      <w:r>
+        <w:rPr>
+          <w:rFonts w:ascii="Consolas" w:eastAsia="Times New Roman" w:hAnsi="Consolas" w:cs="Times New Roman"/>
+          <w:color w:val="AF00DB"/>
+          <w:kern w:val="0"/>
+          <w:sz w:val="21"/>
+          <w:szCs w:val="21"/>
+          <w14:ligatures w14:val="none"/>
+        </w:rPr>
+        <w:t>export</w:t>
+      </w:r>
+      <w:r>
+        <w:rPr>
+          <w:rFonts w:ascii="Consolas" w:eastAsia="Times New Roman" w:hAnsi="Consolas" w:cs="Times New Roman"/>
+          <w:color w:val="202020"/>
+          <w:kern w:val="0"/>
+          <w:sz w:val="21"/>
+          <w:szCs w:val="21"/>
+          <w14:ligatures w14:val="none"/>
+        </w:rPr>
+        <w:t xml:space="preserve"> </w:t>
+      </w:r>
+      <w:r>
+        <w:rPr>
+          <w:rFonts w:ascii="Consolas" w:eastAsia="Times New Roman" w:hAnsi="Consolas" w:cs="Times New Roman"/>
+          <w:color w:val="CF222E"/>
+          <w:kern w:val="0"/>
+          <w:sz w:val="21"/>
+          <w:szCs w:val="21"/>
+          <w14:ligatures w14:val="none"/>
+        </w:rPr>
+        <w:t>function</w:t>
+      </w:r>
+      <w:r>
+        <w:rPr>
+          <w:rFonts w:ascii="Consolas" w:eastAsia="Times New Roman" w:hAnsi="Consolas" w:cs="Times New Roman"/>
+          <w:color w:val="202020"/>
+          <w:kern w:val="0"/>
+          <w:sz w:val="21"/>
+          <w:szCs w:val="21"/>
+          <w14:ligatures w14:val="none"/>
+        </w:rPr>
+        <w:t xml:space="preserve"> </w:t>
+      </w:r>
+      <w:proofErr w:type="gramStart"/>
+      <w:r>
+        <w:rPr>
+          <w:rFonts w:ascii="Consolas" w:eastAsia="Times New Roman" w:hAnsi="Consolas" w:cs="Times New Roman"/>
+          <w:color w:val="8250DF"/>
+          <w:kern w:val="0"/>
+          <w:sz w:val="21"/>
+          <w:szCs w:val="21"/>
+          <w14:ligatures w14:val="none"/>
+        </w:rPr>
+        <w:t>getStringInfo</w:t>
+      </w:r>
+      <w:r>
+        <w:rPr>
+          <w:rFonts w:ascii="Consolas" w:eastAsia="Times New Roman" w:hAnsi="Consolas" w:cs="Times New Roman"/>
+          <w:color w:val="202020"/>
+          <w:kern w:val="0"/>
+          <w:sz w:val="21"/>
+          <w:szCs w:val="21"/>
+          <w14:ligatures w14:val="none"/>
+        </w:rPr>
+        <w:t>(</w:t>
+      </w:r>
+      <w:proofErr w:type="gramEnd"/>
+      <w:r>
+        <w:rPr>
+          <w:rFonts w:ascii="Consolas" w:eastAsia="Times New Roman" w:hAnsi="Consolas" w:cs="Times New Roman"/>
+          <w:color w:val="953800"/>
+          <w:kern w:val="0"/>
+          <w:sz w:val="21"/>
+          <w:szCs w:val="21"/>
+          <w14:ligatures w14:val="none"/>
+        </w:rPr>
+        <w:t>arg</w:t>
+      </w:r>
+      <w:r>
+        <w:rPr>
+          <w:rFonts w:ascii="Consolas" w:eastAsia="Times New Roman" w:hAnsi="Consolas" w:cs="Times New Roman"/>
+          <w:color w:val="000000"/>
+          <w:kern w:val="0"/>
+          <w:sz w:val="21"/>
+          <w:szCs w:val="21"/>
+          <w14:ligatures w14:val="none"/>
+        </w:rPr>
+        <w:t>:</w:t>
+      </w:r>
+      <w:r>
+        <w:rPr>
+          <w:rFonts w:ascii="Consolas" w:eastAsia="Times New Roman" w:hAnsi="Consolas" w:cs="Times New Roman"/>
+          <w:color w:val="202020"/>
+          <w:kern w:val="0"/>
+          <w:sz w:val="21"/>
+          <w:szCs w:val="21"/>
+          <w14:ligatures w14:val="none"/>
+        </w:rPr>
+        <w:t xml:space="preserve"> </w:t>
+      </w:r>
+      <w:r>
+        <w:rPr>
+          <w:rFonts w:ascii="Consolas" w:eastAsia="Times New Roman" w:hAnsi="Consolas" w:cs="Times New Roman"/>
+          <w:color w:val="267F99"/>
+          <w:kern w:val="0"/>
+          <w:sz w:val="21"/>
+          <w:szCs w:val="21"/>
+          <w14:ligatures w14:val="none"/>
+        </w:rPr>
+        <w:t>string</w:t>
+      </w:r>
+      <w:r>
+        <w:rPr>
+          <w:rFonts w:ascii="Consolas" w:eastAsia="Times New Roman" w:hAnsi="Consolas" w:cs="Times New Roman"/>
+          <w:color w:val="202020"/>
+          <w:kern w:val="0"/>
+          <w:sz w:val="21"/>
+          <w:szCs w:val="21"/>
+          <w14:ligatures w14:val="none"/>
+        </w:rPr>
+        <w:t>)</w:t>
+      </w:r>
+      <w:r>
+        <w:rPr>
+          <w:rFonts w:ascii="Consolas" w:eastAsia="Times New Roman" w:hAnsi="Consolas" w:cs="Times New Roman"/>
+          <w:color w:val="000000"/>
+          <w:kern w:val="0"/>
+          <w:sz w:val="21"/>
+          <w:szCs w:val="21"/>
+          <w14:ligatures w14:val="none"/>
+        </w:rPr>
+        <w:t>:</w:t>
+      </w:r>
+      <w:r>
+        <w:rPr>
+          <w:rFonts w:ascii="Consolas" w:eastAsia="Times New Roman" w:hAnsi="Consolas" w:cs="Times New Roman"/>
+          <w:color w:val="202020"/>
+          <w:kern w:val="0"/>
+          <w:sz w:val="21"/>
+          <w:szCs w:val="21"/>
+          <w14:ligatures w14:val="none"/>
+        </w:rPr>
+        <w:t xml:space="preserve"> </w:t>
+      </w:r>
+      <w:r>
+        <w:rPr>
+          <w:rFonts w:ascii="Consolas" w:eastAsia="Times New Roman" w:hAnsi="Consolas" w:cs="Times New Roman"/>
+          <w:color w:val="267F99"/>
+          <w:kern w:val="0"/>
+          <w:sz w:val="21"/>
+          <w:szCs w:val="21"/>
+          <w14:ligatures w14:val="none"/>
+        </w:rPr>
+        <w:t>stringInfo</w:t>
+      </w:r>
+      <w:r>
+        <w:rPr>
+          <w:rFonts w:ascii="Consolas" w:eastAsia="Times New Roman" w:hAnsi="Consolas" w:cs="Times New Roman"/>
+          <w:color w:val="202020"/>
+          <w:kern w:val="0"/>
+          <w:sz w:val="21"/>
+          <w:szCs w:val="21"/>
+          <w14:ligatures w14:val="none"/>
+        </w:rPr>
+        <w:t xml:space="preserve"> </w:t>
+      </w:r>
+      <w:r>
+        <w:rPr>
+          <w:rFonts w:ascii="Consolas" w:eastAsia="Times New Roman" w:hAnsi="Consolas" w:cs="Times New Roman"/>
+          <w:color w:val="1F2328"/>
+          <w:kern w:val="0"/>
+          <w:sz w:val="21"/>
+          <w:szCs w:val="21"/>
+          <w14:ligatures w14:val="none"/>
+        </w:rPr>
+        <w:t>{</w:t>
+      </w:r>
+    </w:p>
+    <w:p>
+      <w:pPr>
+        <w:shd w:val="clear" w:color="auto" w:fill="FFFFFF"/>
+        <w:spacing w:after="0" w:line="285" w:lineRule="atLeast"/>
+        <w:rPr>
+          <w:rFonts w:ascii="Consolas" w:eastAsia="Times New Roman" w:hAnsi="Consolas" w:cs="Times New Roman"/>
+          <w:color w:val="202020"/>
+          <w:kern w:val="0"/>
+          <w:sz w:val="21"/>
+          <w:szCs w:val="21"/>
+          <w14:ligatures w14:val="none"/>
+        </w:rPr>
+      </w:pPr>
+      <w:r>
+        <w:rPr>
+          <w:rFonts w:ascii="Consolas" w:eastAsia="Times New Roman" w:hAnsi="Consolas" w:cs="Times New Roman"/>
+          <w:color w:val="1F2328"/>
+          <w:kern w:val="0"/>
+          <w:sz w:val="21"/>
+          <w:szCs w:val="21"/>
+          <w14:ligatures w14:val="none"/>
+        </w:rPr>
+        <w:t xml:space="preserve">    </w:t>
+      </w:r>
+      <w:r>
+        <w:rPr>
+          <w:rFonts w:ascii="Consolas" w:eastAsia="Times New Roman" w:hAnsi="Consolas" w:cs="Times New Roman"/>
+          <w:color w:val="AF00DB"/>
+          <w:kern w:val="0"/>
+          <w:sz w:val="21"/>
+          <w:szCs w:val="21"/>
+          <w14:ligatures w14:val="none"/>
+        </w:rPr>
+        <w:t>return</w:t>
+      </w:r>
+      <w:r>
+        <w:rPr>
+          <w:rFonts w:ascii="Consolas" w:eastAsia="Times New Roman" w:hAnsi="Consolas" w:cs="Times New Roman"/>
+          <w:color w:val="1F2328"/>
+          <w:kern w:val="0"/>
+          <w:sz w:val="21"/>
+          <w:szCs w:val="21"/>
+          <w14:ligatures w14:val="none"/>
+        </w:rPr>
+        <w:t xml:space="preserve"> {</w:t>
+      </w:r>
+    </w:p>
+    <w:p>
+      <w:pPr>
+        <w:shd w:val="clear" w:color="auto" w:fill="FFFFFF"/>
+        <w:spacing w:after="0" w:line="285" w:lineRule="atLeast"/>
+        <w:rPr>
+          <w:rFonts w:ascii="Consolas" w:eastAsia="Times New Roman" w:hAnsi="Consolas" w:cs="Times New Roman"/>
+          <w:color w:val="202020"/>
+          <w:kern w:val="0"/>
+          <w:sz w:val="21"/>
+          <w:szCs w:val="21"/>
+          <w14:ligatures w14:val="none"/>
+        </w:rPr>
+      </w:pPr>
+      <w:r>
+        <w:rPr>
+          <w:rFonts w:ascii="Consolas" w:eastAsia="Times New Roman" w:hAnsi="Consolas" w:cs="Times New Roman"/>
+          <w:color w:val="1F2328"/>
+          <w:kern w:val="0"/>
+          <w:sz w:val="21"/>
+          <w:szCs w:val="21"/>
+          <w14:ligatures w14:val="none"/>
+        </w:rPr>
+        <w:t>        lowercase</w:t>
+      </w:r>
+      <w:r>
+        <w:rPr>
+          <w:rFonts w:ascii="Consolas" w:eastAsia="Times New Roman" w:hAnsi="Consolas" w:cs="Times New Roman"/>
+          <w:color w:val="001080"/>
+          <w:kern w:val="0"/>
+          <w:sz w:val="21"/>
+          <w:szCs w:val="21"/>
+          <w14:ligatures w14:val="none"/>
+        </w:rPr>
+        <w:t>:</w:t>
+      </w:r>
+      <w:r>
+        <w:rPr>
+          <w:rFonts w:ascii="Consolas" w:eastAsia="Times New Roman" w:hAnsi="Consolas" w:cs="Times New Roman"/>
+          <w:color w:val="1F2328"/>
+          <w:kern w:val="0"/>
+          <w:sz w:val="21"/>
+          <w:szCs w:val="21"/>
+          <w14:ligatures w14:val="none"/>
+        </w:rPr>
+        <w:t xml:space="preserve"> </w:t>
+      </w:r>
+      <w:proofErr w:type="gramStart"/>
+      <w:r>
+        <w:rPr>
+          <w:rFonts w:ascii="Consolas" w:eastAsia="Times New Roman" w:hAnsi="Consolas" w:cs="Times New Roman"/>
+          <w:color w:val="953800"/>
+          <w:kern w:val="0"/>
+          <w:sz w:val="21"/>
+          <w:szCs w:val="21"/>
+          <w14:ligatures w14:val="none"/>
+        </w:rPr>
+        <w:t>arg</w:t>
+      </w:r>
+      <w:r>
+        <w:rPr>
+          <w:rFonts w:ascii="Consolas" w:eastAsia="Times New Roman" w:hAnsi="Consolas" w:cs="Times New Roman"/>
+          <w:color w:val="1F2328"/>
+          <w:kern w:val="0"/>
+          <w:sz w:val="21"/>
+          <w:szCs w:val="21"/>
+          <w14:ligatures w14:val="none"/>
+        </w:rPr>
+        <w:t>.</w:t>
+      </w:r>
+      <w:r>
+        <w:rPr>
+          <w:rFonts w:ascii="Consolas" w:eastAsia="Times New Roman" w:hAnsi="Consolas" w:cs="Times New Roman"/>
+          <w:color w:val="8250DF"/>
+          <w:kern w:val="0"/>
+          <w:sz w:val="21"/>
+          <w:szCs w:val="21"/>
+          <w14:ligatures w14:val="none"/>
+        </w:rPr>
+        <w:t>toLowerCase</w:t>
+      </w:r>
+      <w:proofErr w:type="gramEnd"/>
+      <w:r>
+        <w:rPr>
+          <w:rFonts w:ascii="Consolas" w:eastAsia="Times New Roman" w:hAnsi="Consolas" w:cs="Times New Roman"/>
+          <w:color w:val="1F2328"/>
+          <w:kern w:val="0"/>
+          <w:sz w:val="21"/>
+          <w:szCs w:val="21"/>
+          <w14:ligatures w14:val="none"/>
+        </w:rPr>
+        <w:t>(),</w:t>
+      </w:r>
+    </w:p>
+    <w:p>
+      <w:pPr>
+        <w:shd w:val="clear" w:color="auto" w:fill="FFFFFF"/>
+        <w:spacing w:after="0" w:line="285" w:lineRule="atLeast"/>
+        <w:rPr>
+          <w:rFonts w:ascii="Consolas" w:eastAsia="Times New Roman" w:hAnsi="Consolas" w:cs="Times New Roman"/>
+          <w:color w:val="202020"/>
+          <w:kern w:val="0"/>
+          <w:sz w:val="21"/>
+          <w:szCs w:val="21"/>
+          <w14:ligatures w14:val="none"/>
+        </w:rPr>
+      </w:pPr>
+      <w:r>
+        <w:rPr>
+          <w:rFonts w:ascii="Consolas" w:eastAsia="Times New Roman" w:hAnsi="Consolas" w:cs="Times New Roman"/>
+          <w:color w:val="1F2328"/>
+          <w:kern w:val="0"/>
+          <w:sz w:val="21"/>
+          <w:szCs w:val="21"/>
+          <w14:ligatures w14:val="none"/>
+        </w:rPr>
+        <w:t>        upperCase</w:t>
+      </w:r>
+      <w:r>
+        <w:rPr>
+          <w:rFonts w:ascii="Consolas" w:eastAsia="Times New Roman" w:hAnsi="Consolas" w:cs="Times New Roman"/>
+          <w:color w:val="001080"/>
+          <w:kern w:val="0"/>
+          <w:sz w:val="21"/>
+          <w:szCs w:val="21"/>
+          <w14:ligatures w14:val="none"/>
+        </w:rPr>
+        <w:t>:</w:t>
+      </w:r>
+      <w:r>
+        <w:rPr>
+          <w:rFonts w:ascii="Consolas" w:eastAsia="Times New Roman" w:hAnsi="Consolas" w:cs="Times New Roman"/>
+          <w:color w:val="1F2328"/>
+          <w:kern w:val="0"/>
+          <w:sz w:val="21"/>
+          <w:szCs w:val="21"/>
+          <w14:ligatures w14:val="none"/>
+        </w:rPr>
+        <w:t xml:space="preserve"> </w:t>
+      </w:r>
+      <w:proofErr w:type="gramStart"/>
+      <w:r>
+        <w:rPr>
+          <w:rFonts w:ascii="Consolas" w:eastAsia="Times New Roman" w:hAnsi="Consolas" w:cs="Times New Roman"/>
+          <w:color w:val="953800"/>
+          <w:kern w:val="0"/>
+          <w:sz w:val="21"/>
+          <w:szCs w:val="21"/>
+          <w14:ligatures w14:val="none"/>
+        </w:rPr>
+        <w:t>arg</w:t>
+      </w:r>
+      <w:r>
+        <w:rPr>
+          <w:rFonts w:ascii="Consolas" w:eastAsia="Times New Roman" w:hAnsi="Consolas" w:cs="Times New Roman"/>
+          <w:color w:val="1F2328"/>
+          <w:kern w:val="0"/>
+          <w:sz w:val="21"/>
+          <w:szCs w:val="21"/>
+          <w14:ligatures w14:val="none"/>
+        </w:rPr>
+        <w:t>.</w:t>
+      </w:r>
+      <w:r>
+        <w:rPr>
+          <w:rFonts w:ascii="Consolas" w:eastAsia="Times New Roman" w:hAnsi="Consolas" w:cs="Times New Roman"/>
+          <w:color w:val="8250DF"/>
+          <w:kern w:val="0"/>
+          <w:sz w:val="21"/>
+          <w:szCs w:val="21"/>
+          <w14:ligatures w14:val="none"/>
+        </w:rPr>
+        <w:t>toUpperCase</w:t>
+      </w:r>
+      <w:proofErr w:type="gramEnd"/>
+      <w:r>
+        <w:rPr>
+          <w:rFonts w:ascii="Consolas" w:eastAsia="Times New Roman" w:hAnsi="Consolas" w:cs="Times New Roman"/>
+          <w:color w:val="1F2328"/>
+          <w:kern w:val="0"/>
+          <w:sz w:val="21"/>
+          <w:szCs w:val="21"/>
+          <w14:ligatures w14:val="none"/>
+        </w:rPr>
+        <w:t>(),</w:t>
+      </w:r>
+    </w:p>
+    <w:p>
+      <w:pPr>
+        <w:shd w:val="clear" w:color="auto" w:fill="FFFFFF"/>
+        <w:spacing w:after="0" w:line="285" w:lineRule="atLeast"/>
+        <w:rPr>
+          <w:rFonts w:ascii="Consolas" w:eastAsia="Times New Roman" w:hAnsi="Consolas" w:cs="Times New Roman"/>
+          <w:color w:val="202020"/>
+          <w:kern w:val="0"/>
+          <w:sz w:val="21"/>
+          <w:szCs w:val="21"/>
+          <w14:ligatures w14:val="none"/>
+        </w:rPr>
+      </w:pPr>
+      <w:r>
+        <w:rPr>
+          <w:rFonts w:ascii="Consolas" w:eastAsia="Times New Roman" w:hAnsi="Consolas" w:cs="Times New Roman"/>
+          <w:color w:val="1F2328"/>
+          <w:kern w:val="0"/>
+          <w:sz w:val="21"/>
+          <w:szCs w:val="21"/>
+          <w14:ligatures w14:val="none"/>
+        </w:rPr>
+        <w:t>        characters</w:t>
+      </w:r>
+      <w:r>
+        <w:rPr>
+          <w:rFonts w:ascii="Consolas" w:eastAsia="Times New Roman" w:hAnsi="Consolas" w:cs="Times New Roman"/>
+          <w:color w:val="001080"/>
+          <w:kern w:val="0"/>
+          <w:sz w:val="21"/>
+          <w:szCs w:val="21"/>
+          <w14:ligatures w14:val="none"/>
+        </w:rPr>
+        <w:t>:</w:t>
+      </w:r>
+      <w:r>
+        <w:rPr>
+          <w:rFonts w:ascii="Consolas" w:eastAsia="Times New Roman" w:hAnsi="Consolas" w:cs="Times New Roman"/>
+          <w:color w:val="1F2328"/>
+          <w:kern w:val="0"/>
+          <w:sz w:val="21"/>
+          <w:szCs w:val="21"/>
+          <w14:ligatures w14:val="none"/>
+        </w:rPr>
+        <w:t xml:space="preserve"> [</w:t>
+      </w:r>
+      <w:r>
+        <w:rPr>
+          <w:rFonts w:ascii="Consolas" w:eastAsia="Times New Roman" w:hAnsi="Consolas" w:cs="Times New Roman"/>
+          <w:color w:val="000000"/>
+          <w:kern w:val="0"/>
+          <w:sz w:val="21"/>
+          <w:szCs w:val="21"/>
+          <w14:ligatures w14:val="none"/>
+        </w:rPr>
+        <w:t>...</w:t>
+      </w:r>
+      <w:r>
+        <w:rPr>
+          <w:rFonts w:ascii="Consolas" w:eastAsia="Times New Roman" w:hAnsi="Consolas" w:cs="Times New Roman"/>
+          <w:color w:val="953800"/>
+          <w:kern w:val="0"/>
+          <w:sz w:val="21"/>
+          <w:szCs w:val="21"/>
+          <w14:ligatures w14:val="none"/>
+        </w:rPr>
+        <w:t>arg</w:t>
+      </w:r>
+      <w:r>
+        <w:rPr>
+          <w:rFonts w:ascii="Consolas" w:eastAsia="Times New Roman" w:hAnsi="Consolas" w:cs="Times New Roman"/>
+          <w:color w:val="1F2328"/>
+          <w:kern w:val="0"/>
+          <w:sz w:val="21"/>
+          <w:szCs w:val="21"/>
+          <w14:ligatures w14:val="none"/>
+        </w:rPr>
+        <w:t>],</w:t>
+      </w:r>
+    </w:p>
+    <w:p>
+      <w:pPr>
+        <w:shd w:val="clear" w:color="auto" w:fill="FFFFFF"/>
+        <w:spacing w:after="0" w:line="285" w:lineRule="atLeast"/>
+        <w:rPr>
+          <w:rFonts w:ascii="Consolas" w:eastAsia="Times New Roman" w:hAnsi="Consolas" w:cs="Times New Roman"/>
+          <w:color w:val="202020"/>
+          <w:kern w:val="0"/>
+          <w:sz w:val="21"/>
+          <w:szCs w:val="21"/>
+          <w14:ligatures w14:val="none"/>
+        </w:rPr>
+      </w:pPr>
+      <w:r>
+        <w:rPr>
+          <w:rFonts w:ascii="Consolas" w:eastAsia="Times New Roman" w:hAnsi="Consolas" w:cs="Times New Roman"/>
+          <w:color w:val="1F2328"/>
+          <w:kern w:val="0"/>
+          <w:sz w:val="21"/>
+          <w:szCs w:val="21"/>
+          <w14:ligatures w14:val="none"/>
+        </w:rPr>
+        <w:t>        length</w:t>
+      </w:r>
+      <w:r>
+        <w:rPr>
+          <w:rFonts w:ascii="Consolas" w:eastAsia="Times New Roman" w:hAnsi="Consolas" w:cs="Times New Roman"/>
+          <w:color w:val="001080"/>
+          <w:kern w:val="0"/>
+          <w:sz w:val="21"/>
+          <w:szCs w:val="21"/>
+          <w14:ligatures w14:val="none"/>
+        </w:rPr>
+        <w:t>:</w:t>
+      </w:r>
+      <w:r>
+        <w:rPr>
+          <w:rFonts w:ascii="Consolas" w:eastAsia="Times New Roman" w:hAnsi="Consolas" w:cs="Times New Roman"/>
+          <w:color w:val="1F2328"/>
+          <w:kern w:val="0"/>
+          <w:sz w:val="21"/>
+          <w:szCs w:val="21"/>
+          <w14:ligatures w14:val="none"/>
+        </w:rPr>
+        <w:t xml:space="preserve"> </w:t>
+      </w:r>
+      <w:proofErr w:type="gramStart"/>
+      <w:r>
+        <w:rPr>
+          <w:rFonts w:ascii="Consolas" w:eastAsia="Times New Roman" w:hAnsi="Consolas" w:cs="Times New Roman"/>
+          <w:color w:val="953800"/>
+          <w:kern w:val="0"/>
+          <w:sz w:val="21"/>
+          <w:szCs w:val="21"/>
+          <w14:ligatures w14:val="none"/>
+        </w:rPr>
+        <w:t>arg</w:t>
+      </w:r>
+      <w:r>
+        <w:rPr>
+          <w:rFonts w:ascii="Consolas" w:eastAsia="Times New Roman" w:hAnsi="Consolas" w:cs="Times New Roman"/>
+          <w:color w:val="1F2328"/>
+          <w:kern w:val="0"/>
+          <w:sz w:val="21"/>
+          <w:szCs w:val="21"/>
+          <w14:ligatures w14:val="none"/>
+        </w:rPr>
+        <w:t>.</w:t>
+      </w:r>
+      <w:r>
+        <w:rPr>
+          <w:rFonts w:ascii="Consolas" w:eastAsia="Times New Roman" w:hAnsi="Consolas" w:cs="Times New Roman"/>
+          <w:color w:val="0550AE"/>
+          <w:kern w:val="0"/>
+          <w:sz w:val="21"/>
+          <w:szCs w:val="21"/>
+          <w14:ligatures w14:val="none"/>
+        </w:rPr>
+        <w:t>length</w:t>
+      </w:r>
+      <w:proofErr w:type="gramEnd"/>
+      <w:r>
+        <w:rPr>
+          <w:rFonts w:ascii="Consolas" w:eastAsia="Times New Roman" w:hAnsi="Consolas" w:cs="Times New Roman"/>
+          <w:color w:val="1F2328"/>
+          <w:kern w:val="0"/>
+          <w:sz w:val="21"/>
+          <w:szCs w:val="21"/>
+          <w14:ligatures w14:val="none"/>
+        </w:rPr>
+        <w:t>,</w:t>
+      </w:r>
+    </w:p>
+    <w:p>
+      <w:pPr>
+        <w:shd w:val="clear" w:color="auto" w:fill="FFFFFF"/>
+        <w:spacing w:after="0" w:line="285" w:lineRule="atLeast"/>
+        <w:rPr>
+          <w:rFonts w:ascii="Consolas" w:eastAsia="Times New Roman" w:hAnsi="Consolas" w:cs="Times New Roman"/>
+          <w:color w:val="202020"/>
+          <w:kern w:val="0"/>
+          <w:sz w:val="21"/>
+          <w:szCs w:val="21"/>
+          <w14:ligatures w14:val="none"/>
+        </w:rPr>
+      </w:pPr>
+      <w:r>
+        <w:rPr>
+          <w:rFonts w:ascii="Consolas" w:eastAsia="Times New Roman" w:hAnsi="Consolas" w:cs="Times New Roman"/>
+          <w:color w:val="1F2328"/>
+          <w:kern w:val="0"/>
+          <w:sz w:val="21"/>
+          <w:szCs w:val="21"/>
+          <w14:ligatures w14:val="none"/>
+        </w:rPr>
+        <w:t>        extraInfo</w:t>
+      </w:r>
+      <w:r>
+        <w:rPr>
+          <w:rFonts w:ascii="Consolas" w:eastAsia="Times New Roman" w:hAnsi="Consolas" w:cs="Times New Roman"/>
+          <w:color w:val="001080"/>
+          <w:kern w:val="0"/>
+          <w:sz w:val="21"/>
+          <w:szCs w:val="21"/>
+          <w14:ligatures w14:val="none"/>
+        </w:rPr>
+        <w:t>:</w:t>
+      </w:r>
+      <w:r>
+        <w:rPr>
+          <w:rFonts w:ascii="Consolas" w:eastAsia="Times New Roman" w:hAnsi="Consolas" w:cs="Times New Roman"/>
+          <w:color w:val="1F2328"/>
+          <w:kern w:val="0"/>
+          <w:sz w:val="21"/>
+          <w:szCs w:val="21"/>
+          <w14:ligatures w14:val="none"/>
+        </w:rPr>
+        <w:t xml:space="preserve"> {}</w:t>
+      </w:r>
+    </w:p>
+    <w:p>
+      <w:pPr>
+        <w:shd w:val="clear" w:color="auto" w:fill="FFFFFF"/>
+        <w:spacing w:after="0" w:line="285" w:lineRule="atLeast"/>
+        <w:rPr>
+          <w:rFonts w:ascii="Consolas" w:eastAsia="Times New Roman" w:hAnsi="Consolas" w:cs="Times New Roman"/>
+          <w:color w:val="202020"/>
+          <w:kern w:val="0"/>
+          <w:sz w:val="21"/>
+          <w:szCs w:val="21"/>
+          <w14:ligatures w14:val="none"/>
+        </w:rPr>
+      </w:pPr>
+      <w:r>
+        <w:rPr>
+          <w:rFonts w:ascii="Consolas" w:eastAsia="Times New Roman" w:hAnsi="Consolas" w:cs="Times New Roman"/>
+          <w:color w:val="1F2328"/>
+          <w:kern w:val="0"/>
+          <w:sz w:val="21"/>
+          <w:szCs w:val="21"/>
+          <w14:ligatures w14:val="none"/>
+        </w:rPr>
+        <w:t>    }</w:t>
+      </w:r>
+    </w:p>
+    <w:p>
+      <w:pPr>
+        <w:shd w:val="clear" w:color="auto" w:fill="FFFFFF"/>
+        <w:spacing w:after="0" w:line="285" w:lineRule="atLeast"/>
+        <w:rPr>
+          <w:rFonts w:ascii="Consolas" w:eastAsia="Times New Roman" w:hAnsi="Consolas" w:cs="Times New Roman"/>
+          <w:color w:val="202020"/>
+          <w:kern w:val="0"/>
+          <w:sz w:val="21"/>
+          <w:szCs w:val="21"/>
+          <w14:ligatures w14:val="none"/>
+        </w:rPr>
+      </w:pPr>
+      <w:r>
+        <w:rPr>
+          <w:rFonts w:ascii="Consolas" w:eastAsia="Times New Roman" w:hAnsi="Consolas" w:cs="Times New Roman"/>
+          <w:color w:val="1F2328"/>
+          <w:kern w:val="0"/>
+          <w:sz w:val="21"/>
+          <w:szCs w:val="21"/>
+          <w14:ligatures w14:val="none"/>
+        </w:rPr>
+        <w:t>}</w:t>
+      </w:r>
+    </w:p>
+    <w:p>
+      <w:pPr>
+        <w:shd w:val="clear" w:color="auto" w:fill="FFFFFF"/>
+        <w:spacing w:after="0" w:line="285" w:lineRule="atLeast"/>
+        <w:rPr>
+          <w:rFonts w:ascii="Sakkal Majalla" w:eastAsia="Times New Roman" w:hAnsi="Sakkal Majalla" w:cs="Sakkal Majalla"/>
+          <w:color w:val="202020"/>
+          <w:kern w:val="0"/>
+          <w14:ligatures w14:val="none"/>
+        </w:rPr>
+      </w:pPr>
+    </w:p>
+    <w:p>
+      <w:pPr>
+        <w:shd w:val="clear" w:color="auto" w:fill="FFFFFF"/>
+        <w:spacing w:after="0" w:line="285" w:lineRule="atLeast"/>
+        <w:rPr>
+          <w:rFonts w:ascii="Sakkal Majalla" w:eastAsia="Times New Roman" w:hAnsi="Sakkal Majalla" w:cs="Sakkal Majalla"/>
+          <w:color w:val="202020"/>
+          <w:kern w:val="0"/>
+          <w14:ligatures w14:val="none"/>
+        </w:rPr>
+      </w:pPr>
+      <w:r>
+        <w:rPr>
+          <w:rFonts w:ascii="Sakkal Majalla" w:eastAsia="Times New Roman" w:hAnsi="Sakkal Majalla" w:cs="Sakkal Majalla"/>
+          <w:color w:val="202020"/>
+          <w:kern w:val="0"/>
+          <w14:ligatures w14:val="none"/>
+        </w:rPr>
+        <w:t>The testing matchers:</w:t>
+      </w:r>
+    </w:p>
+    <w:p>
+      <w:pPr>
+        <w:shd w:val="clear" w:color="auto" w:fill="FFFFFF"/>
+        <w:spacing w:after="0" w:line="285" w:lineRule="atLeast"/>
+        <w:rPr>
+          <w:rFonts w:ascii="Consolas" w:eastAsia="Times New Roman" w:hAnsi="Consolas" w:cs="Times New Roman"/>
+          <w:color w:val="202020"/>
+          <w:kern w:val="0"/>
+          <w:sz w:val="21"/>
+          <w:szCs w:val="21"/>
+          <w14:ligatures w14:val="none"/>
+        </w:rPr>
+      </w:pPr>
+      <w:proofErr w:type="gramStart"/>
+      <w:r>
+        <w:rPr>
+          <w:rFonts w:ascii="Consolas" w:eastAsia="Times New Roman" w:hAnsi="Consolas" w:cs="Times New Roman"/>
+          <w:color w:val="8250DF"/>
+          <w:kern w:val="0"/>
+          <w:sz w:val="21"/>
+          <w:szCs w:val="21"/>
+          <w14:ligatures w14:val="none"/>
+        </w:rPr>
+        <w:t>describe</w:t>
+      </w:r>
+      <w:r>
+        <w:rPr>
+          <w:rFonts w:ascii="Consolas" w:eastAsia="Times New Roman" w:hAnsi="Consolas" w:cs="Times New Roman"/>
+          <w:color w:val="202020"/>
+          <w:kern w:val="0"/>
+          <w:sz w:val="21"/>
+          <w:szCs w:val="21"/>
+          <w14:ligatures w14:val="none"/>
+        </w:rPr>
+        <w:t>(</w:t>
+      </w:r>
+      <w:proofErr w:type="gramEnd"/>
+      <w:r>
+        <w:rPr>
+          <w:rFonts w:ascii="Consolas" w:eastAsia="Times New Roman" w:hAnsi="Consolas" w:cs="Times New Roman"/>
+          <w:color w:val="0A3069"/>
+          <w:kern w:val="0"/>
+          <w:sz w:val="21"/>
+          <w:szCs w:val="21"/>
+          <w14:ligatures w14:val="none"/>
+        </w:rPr>
+        <w:t>"Utils test suite"</w:t>
+      </w:r>
+      <w:r>
+        <w:rPr>
+          <w:rFonts w:ascii="Consolas" w:eastAsia="Times New Roman" w:hAnsi="Consolas" w:cs="Times New Roman"/>
+          <w:color w:val="202020"/>
+          <w:kern w:val="0"/>
+          <w:sz w:val="21"/>
+          <w:szCs w:val="21"/>
+          <w14:ligatures w14:val="none"/>
+        </w:rPr>
+        <w:t xml:space="preserve">, () </w:t>
+      </w:r>
+      <w:r>
+        <w:rPr>
+          <w:rFonts w:ascii="Consolas" w:eastAsia="Times New Roman" w:hAnsi="Consolas" w:cs="Times New Roman"/>
+          <w:color w:val="CF222E"/>
+          <w:kern w:val="0"/>
+          <w:sz w:val="21"/>
+          <w:szCs w:val="21"/>
+          <w14:ligatures w14:val="none"/>
+        </w:rPr>
+        <w:t>=&gt;</w:t>
+      </w:r>
+      <w:r>
+        <w:rPr>
+          <w:rFonts w:ascii="Consolas" w:eastAsia="Times New Roman" w:hAnsi="Consolas" w:cs="Times New Roman"/>
+          <w:color w:val="202020"/>
+          <w:kern w:val="0"/>
+          <w:sz w:val="21"/>
+          <w:szCs w:val="21"/>
+          <w14:ligatures w14:val="none"/>
+        </w:rPr>
+        <w:t xml:space="preserve"> </w:t>
+      </w:r>
+      <w:r>
+        <w:rPr>
+          <w:rFonts w:ascii="Consolas" w:eastAsia="Times New Roman" w:hAnsi="Consolas" w:cs="Times New Roman"/>
+          <w:color w:val="1F2328"/>
+          <w:kern w:val="0"/>
+          <w:sz w:val="21"/>
+          <w:szCs w:val="21"/>
+          <w14:ligatures w14:val="none"/>
+        </w:rPr>
+        <w:t>{</w:t>
+      </w:r>
+    </w:p>
+    <w:p>
+      <w:pPr>
+        <w:shd w:val="clear" w:color="auto" w:fill="FFFFFF"/>
+        <w:spacing w:after="0" w:line="285" w:lineRule="atLeast"/>
+        <w:rPr>
+          <w:rFonts w:ascii="Consolas" w:eastAsia="Times New Roman" w:hAnsi="Consolas" w:cs="Times New Roman"/>
+          <w:color w:val="202020"/>
+          <w:kern w:val="0"/>
+          <w:sz w:val="21"/>
+          <w:szCs w:val="21"/>
+          <w14:ligatures w14:val="none"/>
+        </w:rPr>
+      </w:pPr>
+      <w:r>
+        <w:rPr>
+          <w:rFonts w:ascii="Consolas" w:eastAsia="Times New Roman" w:hAnsi="Consolas" w:cs="Times New Roman"/>
+          <w:color w:val="1F2328"/>
+          <w:kern w:val="0"/>
+          <w:sz w:val="21"/>
+          <w:szCs w:val="21"/>
+          <w14:ligatures w14:val="none"/>
+        </w:rPr>
+        <w:t xml:space="preserve">    </w:t>
+      </w:r>
+      <w:proofErr w:type="gramStart"/>
+      <w:r>
+        <w:rPr>
+          <w:rFonts w:ascii="Consolas" w:eastAsia="Times New Roman" w:hAnsi="Consolas" w:cs="Times New Roman"/>
+          <w:color w:val="8250DF"/>
+          <w:kern w:val="0"/>
+          <w:sz w:val="21"/>
+          <w:szCs w:val="21"/>
+          <w14:ligatures w14:val="none"/>
+        </w:rPr>
+        <w:t>it</w:t>
+      </w:r>
+      <w:r>
+        <w:rPr>
+          <w:rFonts w:ascii="Consolas" w:eastAsia="Times New Roman" w:hAnsi="Consolas" w:cs="Times New Roman"/>
+          <w:color w:val="1F2328"/>
+          <w:kern w:val="0"/>
+          <w:sz w:val="21"/>
+          <w:szCs w:val="21"/>
+          <w14:ligatures w14:val="none"/>
+        </w:rPr>
+        <w:t>(</w:t>
+      </w:r>
+      <w:proofErr w:type="gramEnd"/>
+      <w:r>
+        <w:rPr>
+          <w:rFonts w:ascii="Consolas" w:eastAsia="Times New Roman" w:hAnsi="Consolas" w:cs="Times New Roman"/>
+          <w:color w:val="0A3069"/>
+          <w:kern w:val="0"/>
+          <w:sz w:val="21"/>
+          <w:szCs w:val="21"/>
+          <w14:ligatures w14:val="none"/>
+        </w:rPr>
+        <w:t>"should be upper case"</w:t>
+      </w:r>
+      <w:r>
+        <w:rPr>
+          <w:rFonts w:ascii="Consolas" w:eastAsia="Times New Roman" w:hAnsi="Consolas" w:cs="Times New Roman"/>
+          <w:color w:val="1F2328"/>
+          <w:kern w:val="0"/>
+          <w:sz w:val="21"/>
+          <w:szCs w:val="21"/>
+          <w14:ligatures w14:val="none"/>
+        </w:rPr>
+        <w:t xml:space="preserve">, () </w:t>
+      </w:r>
+      <w:r>
+        <w:rPr>
+          <w:rFonts w:ascii="Consolas" w:eastAsia="Times New Roman" w:hAnsi="Consolas" w:cs="Times New Roman"/>
+          <w:color w:val="CF222E"/>
+          <w:kern w:val="0"/>
+          <w:sz w:val="21"/>
+          <w:szCs w:val="21"/>
+          <w14:ligatures w14:val="none"/>
+        </w:rPr>
+        <w:t>=&gt;</w:t>
+      </w:r>
+      <w:r>
+        <w:rPr>
+          <w:rFonts w:ascii="Consolas" w:eastAsia="Times New Roman" w:hAnsi="Consolas" w:cs="Times New Roman"/>
+          <w:color w:val="1F2328"/>
+          <w:kern w:val="0"/>
+          <w:sz w:val="21"/>
+          <w:szCs w:val="21"/>
+          <w14:ligatures w14:val="none"/>
+        </w:rPr>
+        <w:t xml:space="preserve"> {</w:t>
+      </w:r>
+    </w:p>
+    <w:p>
+      <w:pPr>
+        <w:shd w:val="clear" w:color="auto" w:fill="FFFFFF"/>
+        <w:spacing w:after="0" w:line="285" w:lineRule="atLeast"/>
+        <w:rPr>
+          <w:rFonts w:ascii="Consolas" w:eastAsia="Times New Roman" w:hAnsi="Consolas" w:cs="Times New Roman"/>
+          <w:color w:val="202020"/>
+          <w:kern w:val="0"/>
+          <w:sz w:val="21"/>
+          <w:szCs w:val="21"/>
+          <w14:ligatures w14:val="none"/>
+        </w:rPr>
+      </w:pPr>
+      <w:r>
+        <w:rPr>
+          <w:rFonts w:ascii="Consolas" w:eastAsia="Times New Roman" w:hAnsi="Consolas" w:cs="Times New Roman"/>
+          <w:color w:val="1F2328"/>
+          <w:kern w:val="0"/>
+          <w:sz w:val="21"/>
+          <w:szCs w:val="21"/>
+          <w14:ligatures w14:val="none"/>
+        </w:rPr>
+        <w:t xml:space="preserve">        </w:t>
+      </w:r>
+      <w:r>
+        <w:rPr>
+          <w:rFonts w:ascii="Consolas" w:eastAsia="Times New Roman" w:hAnsi="Consolas" w:cs="Times New Roman"/>
+          <w:color w:val="8250DF"/>
+          <w:kern w:val="0"/>
+          <w:sz w:val="21"/>
+          <w:szCs w:val="21"/>
+          <w14:ligatures w14:val="none"/>
+        </w:rPr>
+        <w:t>expect</w:t>
+      </w:r>
+      <w:r>
+        <w:rPr>
+          <w:rFonts w:ascii="Consolas" w:eastAsia="Times New Roman" w:hAnsi="Consolas" w:cs="Times New Roman"/>
+          <w:color w:val="1F2328"/>
+          <w:kern w:val="0"/>
+          <w:sz w:val="21"/>
+          <w:szCs w:val="21"/>
+          <w14:ligatures w14:val="none"/>
+        </w:rPr>
+        <w:t>(</w:t>
+      </w:r>
+      <w:r>
+        <w:rPr>
+          <w:rFonts w:ascii="Consolas" w:eastAsia="Times New Roman" w:hAnsi="Consolas" w:cs="Times New Roman"/>
+          <w:color w:val="8250DF"/>
+          <w:kern w:val="0"/>
+          <w:sz w:val="21"/>
+          <w:szCs w:val="21"/>
+          <w14:ligatures w14:val="none"/>
+        </w:rPr>
+        <w:t>toUpperCase</w:t>
+      </w:r>
+      <w:r>
+        <w:rPr>
+          <w:rFonts w:ascii="Consolas" w:eastAsia="Times New Roman" w:hAnsi="Consolas" w:cs="Times New Roman"/>
+          <w:color w:val="1F2328"/>
+          <w:kern w:val="0"/>
+          <w:sz w:val="21"/>
+          <w:szCs w:val="21"/>
+          <w14:ligatures w14:val="none"/>
+        </w:rPr>
+        <w:t>(</w:t>
+      </w:r>
+      <w:r>
+        <w:rPr>
+          <w:rFonts w:ascii="Consolas" w:eastAsia="Times New Roman" w:hAnsi="Consolas" w:cs="Times New Roman"/>
+          <w:color w:val="0A3069"/>
+          <w:kern w:val="0"/>
+          <w:sz w:val="21"/>
+          <w:szCs w:val="21"/>
+          <w14:ligatures w14:val="none"/>
+        </w:rPr>
+        <w:t>'jloka'</w:t>
+      </w:r>
+      <w:r>
+        <w:rPr>
+          <w:rFonts w:ascii="Consolas" w:eastAsia="Times New Roman" w:hAnsi="Consolas" w:cs="Times New Roman"/>
+          <w:color w:val="1F2328"/>
+          <w:kern w:val="0"/>
+          <w:sz w:val="21"/>
+          <w:szCs w:val="21"/>
+          <w14:ligatures w14:val="none"/>
+        </w:rPr>
+        <w:t>)</w:t>
+      </w:r>
+      <w:proofErr w:type="gramStart"/>
+      <w:r>
+        <w:rPr>
+          <w:rFonts w:ascii="Consolas" w:eastAsia="Times New Roman" w:hAnsi="Consolas" w:cs="Times New Roman"/>
+          <w:color w:val="1F2328"/>
+          <w:kern w:val="0"/>
+          <w:sz w:val="21"/>
+          <w:szCs w:val="21"/>
+          <w14:ligatures w14:val="none"/>
+        </w:rPr>
+        <w:t>).</w:t>
+      </w:r>
+      <w:r>
+        <w:rPr>
+          <w:rFonts w:ascii="Consolas" w:eastAsia="Times New Roman" w:hAnsi="Consolas" w:cs="Times New Roman"/>
+          <w:color w:val="8250DF"/>
+          <w:kern w:val="0"/>
+          <w:sz w:val="21"/>
+          <w:szCs w:val="21"/>
+          <w14:ligatures w14:val="none"/>
+        </w:rPr>
+        <w:t>toBe</w:t>
+      </w:r>
+      <w:proofErr w:type="gramEnd"/>
+      <w:r>
+        <w:rPr>
+          <w:rFonts w:ascii="Consolas" w:eastAsia="Times New Roman" w:hAnsi="Consolas" w:cs="Times New Roman"/>
+          <w:color w:val="1F2328"/>
+          <w:kern w:val="0"/>
+          <w:sz w:val="21"/>
+          <w:szCs w:val="21"/>
+          <w14:ligatures w14:val="none"/>
+        </w:rPr>
+        <w:t>(</w:t>
+      </w:r>
+      <w:r>
+        <w:rPr>
+          <w:rFonts w:ascii="Consolas" w:eastAsia="Times New Roman" w:hAnsi="Consolas" w:cs="Times New Roman"/>
+          <w:color w:val="0A3069"/>
+          <w:kern w:val="0"/>
+          <w:sz w:val="21"/>
+          <w:szCs w:val="21"/>
+          <w14:ligatures w14:val="none"/>
+        </w:rPr>
+        <w:t>"JLOKA"</w:t>
+      </w:r>
+      <w:r>
+        <w:rPr>
+          <w:rFonts w:ascii="Consolas" w:eastAsia="Times New Roman" w:hAnsi="Consolas" w:cs="Times New Roman"/>
+          <w:color w:val="1F2328"/>
+          <w:kern w:val="0"/>
+          <w:sz w:val="21"/>
+          <w:szCs w:val="21"/>
+          <w14:ligatures w14:val="none"/>
+        </w:rPr>
+        <w:t>)</w:t>
+      </w:r>
+    </w:p>
+    <w:p>
+      <w:pPr>
+        <w:shd w:val="clear" w:color="auto" w:fill="FFFFFF"/>
+        <w:spacing w:after="0" w:line="285" w:lineRule="atLeast"/>
+        <w:rPr>
+          <w:rFonts w:ascii="Consolas" w:eastAsia="Times New Roman" w:hAnsi="Consolas" w:cs="Times New Roman"/>
+          <w:color w:val="202020"/>
+          <w:kern w:val="0"/>
+          <w:sz w:val="21"/>
+          <w:szCs w:val="21"/>
+          <w14:ligatures w14:val="none"/>
+        </w:rPr>
+      </w:pPr>
+      <w:r>
+        <w:rPr>
+          <w:rFonts w:ascii="Consolas" w:eastAsia="Times New Roman" w:hAnsi="Consolas" w:cs="Times New Roman"/>
+          <w:color w:val="1F2328"/>
+          <w:kern w:val="0"/>
+          <w:sz w:val="21"/>
+          <w:szCs w:val="21"/>
+          <w14:ligatures w14:val="none"/>
+        </w:rPr>
+        <w:t>    })</w:t>
+      </w:r>
+    </w:p>
+    <w:p>
+      <w:pPr>
+        <w:shd w:val="clear" w:color="auto" w:fill="FFFFFF"/>
+        <w:spacing w:after="0" w:line="285" w:lineRule="atLeast"/>
+        <w:rPr>
+          <w:rFonts w:ascii="Consolas" w:eastAsia="Times New Roman" w:hAnsi="Consolas" w:cs="Times New Roman"/>
+          <w:color w:val="202020"/>
+          <w:kern w:val="0"/>
+          <w:sz w:val="21"/>
+          <w:szCs w:val="21"/>
+          <w14:ligatures w14:val="none"/>
+        </w:rPr>
+      </w:pPr>
+    </w:p>
+    <w:p>
+      <w:pPr>
+        <w:shd w:val="clear" w:color="auto" w:fill="FFFFFF"/>
+        <w:spacing w:after="0" w:line="285" w:lineRule="atLeast"/>
+        <w:rPr>
+          <w:rFonts w:ascii="Consolas" w:eastAsia="Times New Roman" w:hAnsi="Consolas" w:cs="Times New Roman"/>
+          <w:color w:val="202020"/>
+          <w:kern w:val="0"/>
+          <w:sz w:val="21"/>
+          <w:szCs w:val="21"/>
+          <w14:ligatures w14:val="none"/>
+        </w:rPr>
+      </w:pPr>
+      <w:r>
+        <w:rPr>
+          <w:rFonts w:ascii="Consolas" w:eastAsia="Times New Roman" w:hAnsi="Consolas" w:cs="Times New Roman"/>
+          <w:color w:val="1F2328"/>
+          <w:kern w:val="0"/>
+          <w:sz w:val="21"/>
+          <w:szCs w:val="21"/>
+          <w14:ligatures w14:val="none"/>
+        </w:rPr>
+        <w:t xml:space="preserve">    </w:t>
+      </w:r>
+      <w:proofErr w:type="gramStart"/>
+      <w:r>
+        <w:rPr>
+          <w:rFonts w:ascii="Consolas" w:eastAsia="Times New Roman" w:hAnsi="Consolas" w:cs="Times New Roman"/>
+          <w:color w:val="8250DF"/>
+          <w:kern w:val="0"/>
+          <w:sz w:val="21"/>
+          <w:szCs w:val="21"/>
+          <w14:ligatures w14:val="none"/>
+        </w:rPr>
+        <w:t>it</w:t>
+      </w:r>
+      <w:r>
+        <w:rPr>
+          <w:rFonts w:ascii="Consolas" w:eastAsia="Times New Roman" w:hAnsi="Consolas" w:cs="Times New Roman"/>
+          <w:color w:val="1F2328"/>
+          <w:kern w:val="0"/>
+          <w:sz w:val="21"/>
+          <w:szCs w:val="21"/>
+          <w14:ligatures w14:val="none"/>
+        </w:rPr>
+        <w:t>(</w:t>
+      </w:r>
+      <w:proofErr w:type="gramEnd"/>
+      <w:r>
+        <w:rPr>
+          <w:rFonts w:ascii="Consolas" w:eastAsia="Times New Roman" w:hAnsi="Consolas" w:cs="Times New Roman"/>
+          <w:color w:val="0A3069"/>
+          <w:kern w:val="0"/>
+          <w:sz w:val="21"/>
+          <w:szCs w:val="21"/>
+          <w14:ligatures w14:val="none"/>
+        </w:rPr>
+        <w:t>"should test stringInfo function"</w:t>
+      </w:r>
+      <w:r>
+        <w:rPr>
+          <w:rFonts w:ascii="Consolas" w:eastAsia="Times New Roman" w:hAnsi="Consolas" w:cs="Times New Roman"/>
+          <w:color w:val="1F2328"/>
+          <w:kern w:val="0"/>
+          <w:sz w:val="21"/>
+          <w:szCs w:val="21"/>
+          <w14:ligatures w14:val="none"/>
+        </w:rPr>
+        <w:t xml:space="preserve">, () </w:t>
+      </w:r>
+      <w:r>
+        <w:rPr>
+          <w:rFonts w:ascii="Consolas" w:eastAsia="Times New Roman" w:hAnsi="Consolas" w:cs="Times New Roman"/>
+          <w:color w:val="CF222E"/>
+          <w:kern w:val="0"/>
+          <w:sz w:val="21"/>
+          <w:szCs w:val="21"/>
+          <w14:ligatures w14:val="none"/>
+        </w:rPr>
+        <w:t>=&gt;</w:t>
+      </w:r>
+      <w:r>
+        <w:rPr>
+          <w:rFonts w:ascii="Consolas" w:eastAsia="Times New Roman" w:hAnsi="Consolas" w:cs="Times New Roman"/>
+          <w:color w:val="1F2328"/>
+          <w:kern w:val="0"/>
+          <w:sz w:val="21"/>
+          <w:szCs w:val="21"/>
+          <w14:ligatures w14:val="none"/>
+        </w:rPr>
+        <w:t xml:space="preserve"> {</w:t>
+      </w:r>
+    </w:p>
+    <w:p>
+      <w:pPr>
+        <w:shd w:val="clear" w:color="auto" w:fill="FFFFFF"/>
+        <w:spacing w:after="0" w:line="285" w:lineRule="atLeast"/>
+        <w:rPr>
+          <w:rFonts w:ascii="Consolas" w:eastAsia="Times New Roman" w:hAnsi="Consolas" w:cs="Times New Roman"/>
+          <w:color w:val="202020"/>
+          <w:kern w:val="0"/>
+          <w:sz w:val="21"/>
+          <w:szCs w:val="21"/>
+          <w14:ligatures w14:val="none"/>
+        </w:rPr>
+      </w:pPr>
+      <w:r>
+        <w:rPr>
+          <w:rFonts w:ascii="Consolas" w:eastAsia="Times New Roman" w:hAnsi="Consolas" w:cs="Times New Roman"/>
+          <w:color w:val="1F2328"/>
+          <w:kern w:val="0"/>
+          <w:sz w:val="21"/>
+          <w:szCs w:val="21"/>
+          <w14:ligatures w14:val="none"/>
+        </w:rPr>
+        <w:t xml:space="preserve">        </w:t>
+      </w:r>
+      <w:r>
+        <w:rPr>
+          <w:rFonts w:ascii="Consolas" w:eastAsia="Times New Roman" w:hAnsi="Consolas" w:cs="Times New Roman"/>
+          <w:color w:val="CF222E"/>
+          <w:kern w:val="0"/>
+          <w:sz w:val="21"/>
+          <w:szCs w:val="21"/>
+          <w14:ligatures w14:val="none"/>
+        </w:rPr>
+        <w:t>const</w:t>
+      </w:r>
+      <w:r>
+        <w:rPr>
+          <w:rFonts w:ascii="Consolas" w:eastAsia="Times New Roman" w:hAnsi="Consolas" w:cs="Times New Roman"/>
+          <w:color w:val="1F2328"/>
+          <w:kern w:val="0"/>
+          <w:sz w:val="21"/>
+          <w:szCs w:val="21"/>
+          <w14:ligatures w14:val="none"/>
+        </w:rPr>
+        <w:t xml:space="preserve"> </w:t>
+      </w:r>
+      <w:r>
+        <w:rPr>
+          <w:rFonts w:ascii="Consolas" w:eastAsia="Times New Roman" w:hAnsi="Consolas" w:cs="Times New Roman"/>
+          <w:color w:val="0550AE"/>
+          <w:kern w:val="0"/>
+          <w:sz w:val="21"/>
+          <w:szCs w:val="21"/>
+          <w14:ligatures w14:val="none"/>
+        </w:rPr>
+        <w:t>testData</w:t>
+      </w:r>
+      <w:r>
+        <w:rPr>
+          <w:rFonts w:ascii="Consolas" w:eastAsia="Times New Roman" w:hAnsi="Consolas" w:cs="Times New Roman"/>
+          <w:color w:val="1F2328"/>
+          <w:kern w:val="0"/>
+          <w:sz w:val="21"/>
+          <w:szCs w:val="21"/>
+          <w14:ligatures w14:val="none"/>
+        </w:rPr>
+        <w:t xml:space="preserve"> </w:t>
+      </w:r>
+      <w:r>
+        <w:rPr>
+          <w:rFonts w:ascii="Consolas" w:eastAsia="Times New Roman" w:hAnsi="Consolas" w:cs="Times New Roman"/>
+          <w:color w:val="000000"/>
+          <w:kern w:val="0"/>
+          <w:sz w:val="21"/>
+          <w:szCs w:val="21"/>
+          <w14:ligatures w14:val="none"/>
+        </w:rPr>
+        <w:t>=</w:t>
+      </w:r>
+      <w:r>
+        <w:rPr>
+          <w:rFonts w:ascii="Consolas" w:eastAsia="Times New Roman" w:hAnsi="Consolas" w:cs="Times New Roman"/>
+          <w:color w:val="1F2328"/>
+          <w:kern w:val="0"/>
+          <w:sz w:val="21"/>
+          <w:szCs w:val="21"/>
+          <w14:ligatures w14:val="none"/>
+        </w:rPr>
+        <w:t xml:space="preserve"> </w:t>
+      </w:r>
+      <w:r>
+        <w:rPr>
+          <w:rFonts w:ascii="Consolas" w:eastAsia="Times New Roman" w:hAnsi="Consolas" w:cs="Times New Roman"/>
+          <w:color w:val="0A3069"/>
+          <w:kern w:val="0"/>
+          <w:sz w:val="21"/>
+          <w:szCs w:val="21"/>
+          <w14:ligatures w14:val="none"/>
+        </w:rPr>
+        <w:t>"Jafar-Loka"</w:t>
+      </w:r>
+    </w:p>
+    <w:p>
+      <w:pPr>
+        <w:shd w:val="clear" w:color="auto" w:fill="FFFFFF"/>
+        <w:spacing w:after="0" w:line="285" w:lineRule="atLeast"/>
+        <w:rPr>
+          <w:rFonts w:ascii="Consolas" w:eastAsia="Times New Roman" w:hAnsi="Consolas" w:cs="Times New Roman"/>
+          <w:color w:val="202020"/>
+          <w:kern w:val="0"/>
+          <w:sz w:val="21"/>
+          <w:szCs w:val="21"/>
+          <w14:ligatures w14:val="none"/>
+        </w:rPr>
+      </w:pPr>
+      <w:r>
+        <w:rPr>
+          <w:rFonts w:ascii="Consolas" w:eastAsia="Times New Roman" w:hAnsi="Consolas" w:cs="Times New Roman"/>
+          <w:color w:val="1F2328"/>
+          <w:kern w:val="0"/>
+          <w:sz w:val="21"/>
+          <w:szCs w:val="21"/>
+          <w14:ligatures w14:val="none"/>
+        </w:rPr>
+        <w:t xml:space="preserve">        </w:t>
+      </w:r>
+      <w:r>
+        <w:rPr>
+          <w:rFonts w:ascii="Consolas" w:eastAsia="Times New Roman" w:hAnsi="Consolas" w:cs="Times New Roman"/>
+          <w:color w:val="CF222E"/>
+          <w:kern w:val="0"/>
+          <w:sz w:val="21"/>
+          <w:szCs w:val="21"/>
+          <w14:ligatures w14:val="none"/>
+        </w:rPr>
+        <w:t>const</w:t>
+      </w:r>
+      <w:r>
+        <w:rPr>
+          <w:rFonts w:ascii="Consolas" w:eastAsia="Times New Roman" w:hAnsi="Consolas" w:cs="Times New Roman"/>
+          <w:color w:val="1F2328"/>
+          <w:kern w:val="0"/>
+          <w:sz w:val="21"/>
+          <w:szCs w:val="21"/>
+          <w14:ligatures w14:val="none"/>
+        </w:rPr>
+        <w:t xml:space="preserve"> </w:t>
+      </w:r>
+      <w:r>
+        <w:rPr>
+          <w:rFonts w:ascii="Consolas" w:eastAsia="Times New Roman" w:hAnsi="Consolas" w:cs="Times New Roman"/>
+          <w:color w:val="0550AE"/>
+          <w:kern w:val="0"/>
+          <w:sz w:val="21"/>
+          <w:szCs w:val="21"/>
+          <w14:ligatures w14:val="none"/>
+        </w:rPr>
+        <w:t>actual</w:t>
+      </w:r>
+      <w:r>
+        <w:rPr>
+          <w:rFonts w:ascii="Consolas" w:eastAsia="Times New Roman" w:hAnsi="Consolas" w:cs="Times New Roman"/>
+          <w:color w:val="1F2328"/>
+          <w:kern w:val="0"/>
+          <w:sz w:val="21"/>
+          <w:szCs w:val="21"/>
+          <w14:ligatures w14:val="none"/>
+        </w:rPr>
+        <w:t xml:space="preserve"> </w:t>
+      </w:r>
+      <w:r>
+        <w:rPr>
+          <w:rFonts w:ascii="Consolas" w:eastAsia="Times New Roman" w:hAnsi="Consolas" w:cs="Times New Roman"/>
+          <w:color w:val="000000"/>
+          <w:kern w:val="0"/>
+          <w:sz w:val="21"/>
+          <w:szCs w:val="21"/>
+          <w14:ligatures w14:val="none"/>
+        </w:rPr>
+        <w:t>=</w:t>
+      </w:r>
+      <w:r>
+        <w:rPr>
+          <w:rFonts w:ascii="Consolas" w:eastAsia="Times New Roman" w:hAnsi="Consolas" w:cs="Times New Roman"/>
+          <w:color w:val="1F2328"/>
+          <w:kern w:val="0"/>
+          <w:sz w:val="21"/>
+          <w:szCs w:val="21"/>
+          <w14:ligatures w14:val="none"/>
+        </w:rPr>
+        <w:t xml:space="preserve"> </w:t>
+      </w:r>
+      <w:r>
+        <w:rPr>
+          <w:rFonts w:ascii="Consolas" w:eastAsia="Times New Roman" w:hAnsi="Consolas" w:cs="Times New Roman"/>
+          <w:color w:val="8250DF"/>
+          <w:kern w:val="0"/>
+          <w:sz w:val="21"/>
+          <w:szCs w:val="21"/>
+          <w14:ligatures w14:val="none"/>
+        </w:rPr>
+        <w:t>getStringInfo</w:t>
+      </w:r>
+      <w:r>
+        <w:rPr>
+          <w:rFonts w:ascii="Consolas" w:eastAsia="Times New Roman" w:hAnsi="Consolas" w:cs="Times New Roman"/>
+          <w:color w:val="1F2328"/>
+          <w:kern w:val="0"/>
+          <w:sz w:val="21"/>
+          <w:szCs w:val="21"/>
+          <w14:ligatures w14:val="none"/>
+        </w:rPr>
+        <w:t>(</w:t>
+      </w:r>
+      <w:r>
+        <w:rPr>
+          <w:rFonts w:ascii="Consolas" w:eastAsia="Times New Roman" w:hAnsi="Consolas" w:cs="Times New Roman"/>
+          <w:color w:val="0550AE"/>
+          <w:kern w:val="0"/>
+          <w:sz w:val="21"/>
+          <w:szCs w:val="21"/>
+          <w14:ligatures w14:val="none"/>
+        </w:rPr>
+        <w:t>testData</w:t>
+      </w:r>
+      <w:r>
+        <w:rPr>
+          <w:rFonts w:ascii="Consolas" w:eastAsia="Times New Roman" w:hAnsi="Consolas" w:cs="Times New Roman"/>
+          <w:color w:val="1F2328"/>
+          <w:kern w:val="0"/>
+          <w:sz w:val="21"/>
+          <w:szCs w:val="21"/>
+          <w14:ligatures w14:val="none"/>
+        </w:rPr>
+        <w:t>)</w:t>
+      </w:r>
+    </w:p>
+    <w:p>
+      <w:pPr>
+        <w:shd w:val="clear" w:color="auto" w:fill="FFFFFF"/>
+        <w:spacing w:after="0" w:line="285" w:lineRule="atLeast"/>
+        <w:rPr>
+          <w:rFonts w:ascii="Consolas" w:eastAsia="Times New Roman" w:hAnsi="Consolas" w:cs="Times New Roman"/>
+          <w:color w:val="202020"/>
+          <w:kern w:val="0"/>
+          <w:sz w:val="21"/>
+          <w:szCs w:val="21"/>
+          <w14:ligatures w14:val="none"/>
+        </w:rPr>
+      </w:pPr>
+    </w:p>
+    <w:p>
+      <w:pPr>
+        <w:shd w:val="clear" w:color="auto" w:fill="FFFFFF"/>
+        <w:spacing w:after="0" w:line="285" w:lineRule="atLeast"/>
+        <w:rPr>
+          <w:rFonts w:ascii="Consolas" w:eastAsia="Times New Roman" w:hAnsi="Consolas" w:cs="Times New Roman"/>
+          <w:color w:val="202020"/>
+          <w:kern w:val="0"/>
+          <w:sz w:val="21"/>
+          <w:szCs w:val="21"/>
+          <w14:ligatures w14:val="none"/>
+        </w:rPr>
+      </w:pPr>
+      <w:r>
+        <w:rPr>
+          <w:rFonts w:ascii="Consolas" w:eastAsia="Times New Roman" w:hAnsi="Consolas" w:cs="Times New Roman"/>
+          <w:color w:val="1F2328"/>
+          <w:kern w:val="0"/>
+          <w:sz w:val="21"/>
+          <w:szCs w:val="21"/>
+          <w14:ligatures w14:val="none"/>
+        </w:rPr>
+        <w:t xml:space="preserve">        </w:t>
+      </w:r>
+      <w:r>
+        <w:rPr>
+          <w:rFonts w:ascii="Consolas" w:eastAsia="Times New Roman" w:hAnsi="Consolas" w:cs="Times New Roman"/>
+          <w:color w:val="8250DF"/>
+          <w:kern w:val="0"/>
+          <w:sz w:val="21"/>
+          <w:szCs w:val="21"/>
+          <w14:ligatures w14:val="none"/>
+        </w:rPr>
+        <w:t>expect</w:t>
+      </w:r>
+      <w:r>
+        <w:rPr>
+          <w:rFonts w:ascii="Consolas" w:eastAsia="Times New Roman" w:hAnsi="Consolas" w:cs="Times New Roman"/>
+          <w:color w:val="1F2328"/>
+          <w:kern w:val="0"/>
+          <w:sz w:val="21"/>
+          <w:szCs w:val="21"/>
+          <w14:ligatures w14:val="none"/>
+        </w:rPr>
+        <w:t>(</w:t>
+      </w:r>
+      <w:r>
+        <w:rPr>
+          <w:rFonts w:ascii="Consolas" w:eastAsia="Times New Roman" w:hAnsi="Consolas" w:cs="Times New Roman"/>
+          <w:color w:val="0550AE"/>
+          <w:kern w:val="0"/>
+          <w:sz w:val="21"/>
+          <w:szCs w:val="21"/>
+          <w14:ligatures w14:val="none"/>
+        </w:rPr>
+        <w:t>actual</w:t>
+      </w:r>
+      <w:proofErr w:type="gramStart"/>
+      <w:r>
+        <w:rPr>
+          <w:rFonts w:ascii="Consolas" w:eastAsia="Times New Roman" w:hAnsi="Consolas" w:cs="Times New Roman"/>
+          <w:color w:val="1F2328"/>
+          <w:kern w:val="0"/>
+          <w:sz w:val="21"/>
+          <w:szCs w:val="21"/>
+          <w14:ligatures w14:val="none"/>
+        </w:rPr>
+        <w:t>).not</w:t>
+      </w:r>
+      <w:proofErr w:type="gramEnd"/>
+      <w:r>
+        <w:rPr>
+          <w:rFonts w:ascii="Consolas" w:eastAsia="Times New Roman" w:hAnsi="Consolas" w:cs="Times New Roman"/>
+          <w:color w:val="1F2328"/>
+          <w:kern w:val="0"/>
+          <w:sz w:val="21"/>
+          <w:szCs w:val="21"/>
+          <w14:ligatures w14:val="none"/>
+        </w:rPr>
+        <w:t>.</w:t>
+      </w:r>
+      <w:proofErr w:type="gramStart"/>
+      <w:r>
+        <w:rPr>
+          <w:rFonts w:ascii="Consolas" w:eastAsia="Times New Roman" w:hAnsi="Consolas" w:cs="Times New Roman"/>
+          <w:color w:val="8250DF"/>
+          <w:kern w:val="0"/>
+          <w:sz w:val="21"/>
+          <w:szCs w:val="21"/>
+          <w14:ligatures w14:val="none"/>
+        </w:rPr>
+        <w:t>toBeNull</w:t>
+      </w:r>
+      <w:r>
+        <w:rPr>
+          <w:rFonts w:ascii="Consolas" w:eastAsia="Times New Roman" w:hAnsi="Consolas" w:cs="Times New Roman"/>
+          <w:color w:val="1F2328"/>
+          <w:kern w:val="0"/>
+          <w:sz w:val="21"/>
+          <w:szCs w:val="21"/>
+          <w14:ligatures w14:val="none"/>
+        </w:rPr>
+        <w:t>(</w:t>
+      </w:r>
+      <w:proofErr w:type="gramEnd"/>
+      <w:r>
+        <w:rPr>
+          <w:rFonts w:ascii="Consolas" w:eastAsia="Times New Roman" w:hAnsi="Consolas" w:cs="Times New Roman"/>
+          <w:color w:val="1F2328"/>
+          <w:kern w:val="0"/>
+          <w:sz w:val="21"/>
+          <w:szCs w:val="21"/>
+          <w14:ligatures w14:val="none"/>
+        </w:rPr>
+        <w:t>)</w:t>
+      </w:r>
+    </w:p>
+    <w:p>
+      <w:pPr>
+        <w:shd w:val="clear" w:color="auto" w:fill="FFFFFF"/>
+        <w:spacing w:after="0" w:line="285" w:lineRule="atLeast"/>
+        <w:rPr>
+          <w:rFonts w:ascii="Consolas" w:eastAsia="Times New Roman" w:hAnsi="Consolas" w:cs="Times New Roman"/>
+          <w:color w:val="202020"/>
+          <w:kern w:val="0"/>
+          <w:sz w:val="21"/>
+          <w:szCs w:val="21"/>
+          <w14:ligatures w14:val="none"/>
+        </w:rPr>
+      </w:pPr>
+      <w:r>
+        <w:rPr>
+          <w:rFonts w:ascii="Consolas" w:eastAsia="Times New Roman" w:hAnsi="Consolas" w:cs="Times New Roman"/>
+          <w:color w:val="1F2328"/>
+          <w:kern w:val="0"/>
+          <w:sz w:val="21"/>
+          <w:szCs w:val="21"/>
+          <w14:ligatures w14:val="none"/>
+        </w:rPr>
+        <w:t xml:space="preserve">        </w:t>
+      </w:r>
+      <w:r>
+        <w:rPr>
+          <w:rFonts w:ascii="Consolas" w:eastAsia="Times New Roman" w:hAnsi="Consolas" w:cs="Times New Roman"/>
+          <w:color w:val="8250DF"/>
+          <w:kern w:val="0"/>
+          <w:sz w:val="21"/>
+          <w:szCs w:val="21"/>
+          <w14:ligatures w14:val="none"/>
+        </w:rPr>
+        <w:t>expect</w:t>
+      </w:r>
+      <w:r>
+        <w:rPr>
+          <w:rFonts w:ascii="Consolas" w:eastAsia="Times New Roman" w:hAnsi="Consolas" w:cs="Times New Roman"/>
+          <w:color w:val="1F2328"/>
+          <w:kern w:val="0"/>
+          <w:sz w:val="21"/>
+          <w:szCs w:val="21"/>
+          <w14:ligatures w14:val="none"/>
+        </w:rPr>
+        <w:t>(</w:t>
+      </w:r>
+      <w:proofErr w:type="gramStart"/>
+      <w:r>
+        <w:rPr>
+          <w:rFonts w:ascii="Consolas" w:eastAsia="Times New Roman" w:hAnsi="Consolas" w:cs="Times New Roman"/>
+          <w:color w:val="0550AE"/>
+          <w:kern w:val="0"/>
+          <w:sz w:val="21"/>
+          <w:szCs w:val="21"/>
+          <w14:ligatures w14:val="none"/>
+        </w:rPr>
+        <w:t>actual</w:t>
+      </w:r>
+      <w:r>
+        <w:rPr>
+          <w:rFonts w:ascii="Consolas" w:eastAsia="Times New Roman" w:hAnsi="Consolas" w:cs="Times New Roman"/>
+          <w:color w:val="1F2328"/>
+          <w:kern w:val="0"/>
+          <w:sz w:val="21"/>
+          <w:szCs w:val="21"/>
+          <w14:ligatures w14:val="none"/>
+        </w:rPr>
+        <w:t>.lowercase).</w:t>
+      </w:r>
+      <w:r>
+        <w:rPr>
+          <w:rFonts w:ascii="Consolas" w:eastAsia="Times New Roman" w:hAnsi="Consolas" w:cs="Times New Roman"/>
+          <w:color w:val="8250DF"/>
+          <w:kern w:val="0"/>
+          <w:sz w:val="21"/>
+          <w:szCs w:val="21"/>
+          <w14:ligatures w14:val="none"/>
+        </w:rPr>
+        <w:t>toBe</w:t>
+      </w:r>
+      <w:proofErr w:type="gramEnd"/>
+      <w:r>
+        <w:rPr>
+          <w:rFonts w:ascii="Consolas" w:eastAsia="Times New Roman" w:hAnsi="Consolas" w:cs="Times New Roman"/>
+          <w:color w:val="1F2328"/>
+          <w:kern w:val="0"/>
+          <w:sz w:val="21"/>
+          <w:szCs w:val="21"/>
+          <w14:ligatures w14:val="none"/>
+        </w:rPr>
+        <w:t>(</w:t>
+      </w:r>
+      <w:r>
+        <w:rPr>
+          <w:rFonts w:ascii="Consolas" w:eastAsia="Times New Roman" w:hAnsi="Consolas" w:cs="Times New Roman"/>
+          <w:color w:val="0550AE"/>
+          <w:kern w:val="0"/>
+          <w:sz w:val="21"/>
+          <w:szCs w:val="21"/>
+          <w14:ligatures w14:val="none"/>
+        </w:rPr>
+        <w:t>testData</w:t>
+      </w:r>
+      <w:r>
+        <w:rPr>
+          <w:rFonts w:ascii="Consolas" w:eastAsia="Times New Roman" w:hAnsi="Consolas" w:cs="Times New Roman"/>
+          <w:color w:val="1F2328"/>
+          <w:kern w:val="0"/>
+          <w:sz w:val="21"/>
+          <w:szCs w:val="21"/>
+          <w14:ligatures w14:val="none"/>
+        </w:rPr>
+        <w:t>.</w:t>
+      </w:r>
+      <w:r>
+        <w:rPr>
+          <w:rFonts w:ascii="Consolas" w:eastAsia="Times New Roman" w:hAnsi="Consolas" w:cs="Times New Roman"/>
+          <w:color w:val="8250DF"/>
+          <w:kern w:val="0"/>
+          <w:sz w:val="21"/>
+          <w:szCs w:val="21"/>
+          <w14:ligatures w14:val="none"/>
+        </w:rPr>
+        <w:t>toLowerCase</w:t>
+      </w:r>
+      <w:r>
+        <w:rPr>
+          <w:rFonts w:ascii="Consolas" w:eastAsia="Times New Roman" w:hAnsi="Consolas" w:cs="Times New Roman"/>
+          <w:color w:val="1F2328"/>
+          <w:kern w:val="0"/>
+          <w:sz w:val="21"/>
+          <w:szCs w:val="21"/>
+          <w14:ligatures w14:val="none"/>
+        </w:rPr>
+        <w:t>())</w:t>
+      </w:r>
+    </w:p>
+    <w:p>
+      <w:pPr>
+        <w:shd w:val="clear" w:color="auto" w:fill="FFFFFF"/>
+        <w:spacing w:after="0" w:line="285" w:lineRule="atLeast"/>
+        <w:rPr>
+          <w:rFonts w:ascii="Consolas" w:eastAsia="Times New Roman" w:hAnsi="Consolas" w:cs="Times New Roman"/>
+          <w:color w:val="202020"/>
+          <w:kern w:val="0"/>
+          <w:sz w:val="21"/>
+          <w:szCs w:val="21"/>
+          <w14:ligatures w14:val="none"/>
+        </w:rPr>
+      </w:pPr>
+      <w:r>
+        <w:rPr>
+          <w:rFonts w:ascii="Consolas" w:eastAsia="Times New Roman" w:hAnsi="Consolas" w:cs="Times New Roman"/>
+          <w:color w:val="1F2328"/>
+          <w:kern w:val="0"/>
+          <w:sz w:val="21"/>
+          <w:szCs w:val="21"/>
+          <w14:ligatures w14:val="none"/>
+        </w:rPr>
+        <w:t xml:space="preserve">        </w:t>
+      </w:r>
+      <w:r>
+        <w:rPr>
+          <w:rFonts w:ascii="Consolas" w:eastAsia="Times New Roman" w:hAnsi="Consolas" w:cs="Times New Roman"/>
+          <w:color w:val="8250DF"/>
+          <w:kern w:val="0"/>
+          <w:sz w:val="21"/>
+          <w:szCs w:val="21"/>
+          <w14:ligatures w14:val="none"/>
+        </w:rPr>
+        <w:t>expect</w:t>
+      </w:r>
+      <w:r>
+        <w:rPr>
+          <w:rFonts w:ascii="Consolas" w:eastAsia="Times New Roman" w:hAnsi="Consolas" w:cs="Times New Roman"/>
+          <w:color w:val="1F2328"/>
+          <w:kern w:val="0"/>
+          <w:sz w:val="21"/>
+          <w:szCs w:val="21"/>
+          <w14:ligatures w14:val="none"/>
+        </w:rPr>
+        <w:t>(</w:t>
+      </w:r>
+      <w:proofErr w:type="gramStart"/>
+      <w:r>
+        <w:rPr>
+          <w:rFonts w:ascii="Consolas" w:eastAsia="Times New Roman" w:hAnsi="Consolas" w:cs="Times New Roman"/>
+          <w:color w:val="0550AE"/>
+          <w:kern w:val="0"/>
+          <w:sz w:val="21"/>
+          <w:szCs w:val="21"/>
+          <w14:ligatures w14:val="none"/>
+        </w:rPr>
+        <w:t>actual</w:t>
+      </w:r>
+      <w:r>
+        <w:rPr>
+          <w:rFonts w:ascii="Consolas" w:eastAsia="Times New Roman" w:hAnsi="Consolas" w:cs="Times New Roman"/>
+          <w:color w:val="1F2328"/>
+          <w:kern w:val="0"/>
+          <w:sz w:val="21"/>
+          <w:szCs w:val="21"/>
+          <w14:ligatures w14:val="none"/>
+        </w:rPr>
+        <w:t>.upperCase).</w:t>
+      </w:r>
+      <w:r>
+        <w:rPr>
+          <w:rFonts w:ascii="Consolas" w:eastAsia="Times New Roman" w:hAnsi="Consolas" w:cs="Times New Roman"/>
+          <w:color w:val="8250DF"/>
+          <w:kern w:val="0"/>
+          <w:sz w:val="21"/>
+          <w:szCs w:val="21"/>
+          <w14:ligatures w14:val="none"/>
+        </w:rPr>
+        <w:t>toBe</w:t>
+      </w:r>
+      <w:proofErr w:type="gramEnd"/>
+      <w:r>
+        <w:rPr>
+          <w:rFonts w:ascii="Consolas" w:eastAsia="Times New Roman" w:hAnsi="Consolas" w:cs="Times New Roman"/>
+          <w:color w:val="1F2328"/>
+          <w:kern w:val="0"/>
+          <w:sz w:val="21"/>
+          <w:szCs w:val="21"/>
+          <w14:ligatures w14:val="none"/>
+        </w:rPr>
+        <w:t>(</w:t>
+      </w:r>
+      <w:r>
+        <w:rPr>
+          <w:rFonts w:ascii="Consolas" w:eastAsia="Times New Roman" w:hAnsi="Consolas" w:cs="Times New Roman"/>
+          <w:color w:val="0550AE"/>
+          <w:kern w:val="0"/>
+          <w:sz w:val="21"/>
+          <w:szCs w:val="21"/>
+          <w14:ligatures w14:val="none"/>
+        </w:rPr>
+        <w:t>testData</w:t>
+      </w:r>
+      <w:r>
+        <w:rPr>
+          <w:rFonts w:ascii="Consolas" w:eastAsia="Times New Roman" w:hAnsi="Consolas" w:cs="Times New Roman"/>
+          <w:color w:val="1F2328"/>
+          <w:kern w:val="0"/>
+          <w:sz w:val="21"/>
+          <w:szCs w:val="21"/>
+          <w14:ligatures w14:val="none"/>
+        </w:rPr>
+        <w:t>.</w:t>
+      </w:r>
+      <w:r>
+        <w:rPr>
+          <w:rFonts w:ascii="Consolas" w:eastAsia="Times New Roman" w:hAnsi="Consolas" w:cs="Times New Roman"/>
+          <w:color w:val="8250DF"/>
+          <w:kern w:val="0"/>
+          <w:sz w:val="21"/>
+          <w:szCs w:val="21"/>
+          <w14:ligatures w14:val="none"/>
+        </w:rPr>
+        <w:t>toUpperCase</w:t>
+      </w:r>
+      <w:r>
+        <w:rPr>
+          <w:rFonts w:ascii="Consolas" w:eastAsia="Times New Roman" w:hAnsi="Consolas" w:cs="Times New Roman"/>
+          <w:color w:val="1F2328"/>
+          <w:kern w:val="0"/>
+          <w:sz w:val="21"/>
+          <w:szCs w:val="21"/>
+          <w14:ligatures w14:val="none"/>
+        </w:rPr>
+        <w:t>())</w:t>
+      </w:r>
+    </w:p>
+    <w:p>
+      <w:pPr>
+        <w:shd w:val="clear" w:color="auto" w:fill="FFFFFF"/>
+        <w:spacing w:after="0" w:line="285" w:lineRule="atLeast"/>
+        <w:rPr>
+          <w:rFonts w:ascii="Consolas" w:eastAsia="Times New Roman" w:hAnsi="Consolas" w:cs="Times New Roman"/>
+          <w:color w:val="202020"/>
+          <w:kern w:val="0"/>
+          <w:sz w:val="21"/>
+          <w:szCs w:val="21"/>
+          <w14:ligatures w14:val="none"/>
+        </w:rPr>
+      </w:pPr>
+      <w:r>
+        <w:rPr>
+          <w:rFonts w:ascii="Consolas" w:eastAsia="Times New Roman" w:hAnsi="Consolas" w:cs="Times New Roman"/>
+          <w:color w:val="1F2328"/>
+          <w:kern w:val="0"/>
+          <w:sz w:val="21"/>
+          <w:szCs w:val="21"/>
+          <w14:ligatures w14:val="none"/>
+        </w:rPr>
+        <w:t xml:space="preserve">        </w:t>
+      </w:r>
+      <w:r>
+        <w:rPr>
+          <w:rFonts w:ascii="Consolas" w:eastAsia="Times New Roman" w:hAnsi="Consolas" w:cs="Times New Roman"/>
+          <w:color w:val="8250DF"/>
+          <w:kern w:val="0"/>
+          <w:sz w:val="21"/>
+          <w:szCs w:val="21"/>
+          <w14:ligatures w14:val="none"/>
+        </w:rPr>
+        <w:t>expect</w:t>
+      </w:r>
+      <w:r>
+        <w:rPr>
+          <w:rFonts w:ascii="Consolas" w:eastAsia="Times New Roman" w:hAnsi="Consolas" w:cs="Times New Roman"/>
+          <w:color w:val="1F2328"/>
+          <w:kern w:val="0"/>
+          <w:sz w:val="21"/>
+          <w:szCs w:val="21"/>
+          <w14:ligatures w14:val="none"/>
+        </w:rPr>
+        <w:t>(</w:t>
+      </w:r>
+      <w:proofErr w:type="gramStart"/>
+      <w:r>
+        <w:rPr>
+          <w:rFonts w:ascii="Consolas" w:eastAsia="Times New Roman" w:hAnsi="Consolas" w:cs="Times New Roman"/>
+          <w:color w:val="0550AE"/>
+          <w:kern w:val="0"/>
+          <w:sz w:val="21"/>
+          <w:szCs w:val="21"/>
+          <w14:ligatures w14:val="none"/>
+        </w:rPr>
+        <w:t>actual</w:t>
+      </w:r>
+      <w:r>
+        <w:rPr>
+          <w:rFonts w:ascii="Consolas" w:eastAsia="Times New Roman" w:hAnsi="Consolas" w:cs="Times New Roman"/>
+          <w:color w:val="1F2328"/>
+          <w:kern w:val="0"/>
+          <w:sz w:val="21"/>
+          <w:szCs w:val="21"/>
+          <w14:ligatures w14:val="none"/>
+        </w:rPr>
+        <w:t>.length).</w:t>
+      </w:r>
+      <w:r>
+        <w:rPr>
+          <w:rFonts w:ascii="Consolas" w:eastAsia="Times New Roman" w:hAnsi="Consolas" w:cs="Times New Roman"/>
+          <w:color w:val="8250DF"/>
+          <w:kern w:val="0"/>
+          <w:sz w:val="21"/>
+          <w:szCs w:val="21"/>
+          <w14:ligatures w14:val="none"/>
+        </w:rPr>
+        <w:t>toEqual</w:t>
+      </w:r>
+      <w:proofErr w:type="gramEnd"/>
+      <w:r>
+        <w:rPr>
+          <w:rFonts w:ascii="Consolas" w:eastAsia="Times New Roman" w:hAnsi="Consolas" w:cs="Times New Roman"/>
+          <w:color w:val="1F2328"/>
+          <w:kern w:val="0"/>
+          <w:sz w:val="21"/>
+          <w:szCs w:val="21"/>
+          <w14:ligatures w14:val="none"/>
+        </w:rPr>
+        <w:t>(</w:t>
+      </w:r>
+      <w:r>
+        <w:rPr>
+          <w:rFonts w:ascii="Consolas" w:eastAsia="Times New Roman" w:hAnsi="Consolas" w:cs="Times New Roman"/>
+          <w:color w:val="0550AE"/>
+          <w:kern w:val="0"/>
+          <w:sz w:val="21"/>
+          <w:szCs w:val="21"/>
+          <w14:ligatures w14:val="none"/>
+        </w:rPr>
+        <w:t>testData</w:t>
+      </w:r>
+      <w:r>
+        <w:rPr>
+          <w:rFonts w:ascii="Consolas" w:eastAsia="Times New Roman" w:hAnsi="Consolas" w:cs="Times New Roman"/>
+          <w:color w:val="1F2328"/>
+          <w:kern w:val="0"/>
+          <w:sz w:val="21"/>
+          <w:szCs w:val="21"/>
+          <w14:ligatures w14:val="none"/>
+        </w:rPr>
+        <w:t>.</w:t>
+      </w:r>
+      <w:r>
+        <w:rPr>
+          <w:rFonts w:ascii="Consolas" w:eastAsia="Times New Roman" w:hAnsi="Consolas" w:cs="Times New Roman"/>
+          <w:color w:val="0550AE"/>
+          <w:kern w:val="0"/>
+          <w:sz w:val="21"/>
+          <w:szCs w:val="21"/>
+          <w14:ligatures w14:val="none"/>
+        </w:rPr>
+        <w:t>length</w:t>
+      </w:r>
+      <w:r>
+        <w:rPr>
+          <w:rFonts w:ascii="Consolas" w:eastAsia="Times New Roman" w:hAnsi="Consolas" w:cs="Times New Roman"/>
+          <w:color w:val="1F2328"/>
+          <w:kern w:val="0"/>
+          <w:sz w:val="21"/>
+          <w:szCs w:val="21"/>
+          <w14:ligatures w14:val="none"/>
+        </w:rPr>
+        <w:t>)</w:t>
+      </w:r>
+    </w:p>
+    <w:p>
+      <w:pPr>
+        <w:shd w:val="clear" w:color="auto" w:fill="FFFFFF"/>
+        <w:spacing w:after="0" w:line="285" w:lineRule="atLeast"/>
+        <w:rPr>
+          <w:rFonts w:ascii="Consolas" w:eastAsia="Times New Roman" w:hAnsi="Consolas" w:cs="Times New Roman"/>
+          <w:color w:val="202020"/>
+          <w:kern w:val="0"/>
+          <w:sz w:val="21"/>
+          <w:szCs w:val="21"/>
+          <w14:ligatures w14:val="none"/>
+        </w:rPr>
+      </w:pPr>
+      <w:r>
+        <w:rPr>
+          <w:rFonts w:ascii="Consolas" w:eastAsia="Times New Roman" w:hAnsi="Consolas" w:cs="Times New Roman"/>
+          <w:color w:val="1F2328"/>
+          <w:kern w:val="0"/>
+          <w:sz w:val="21"/>
+          <w:szCs w:val="21"/>
+          <w14:ligatures w14:val="none"/>
+        </w:rPr>
+        <w:t xml:space="preserve">        </w:t>
+      </w:r>
+      <w:r>
+        <w:rPr>
+          <w:rFonts w:ascii="Consolas" w:eastAsia="Times New Roman" w:hAnsi="Consolas" w:cs="Times New Roman"/>
+          <w:color w:val="8250DF"/>
+          <w:kern w:val="0"/>
+          <w:sz w:val="21"/>
+          <w:szCs w:val="21"/>
+          <w14:ligatures w14:val="none"/>
+        </w:rPr>
+        <w:t>expect</w:t>
+      </w:r>
+      <w:r>
+        <w:rPr>
+          <w:rFonts w:ascii="Consolas" w:eastAsia="Times New Roman" w:hAnsi="Consolas" w:cs="Times New Roman"/>
+          <w:color w:val="1F2328"/>
+          <w:kern w:val="0"/>
+          <w:sz w:val="21"/>
+          <w:szCs w:val="21"/>
+          <w14:ligatures w14:val="none"/>
+        </w:rPr>
+        <w:t>(</w:t>
+      </w:r>
+      <w:proofErr w:type="gramStart"/>
+      <w:r>
+        <w:rPr>
+          <w:rFonts w:ascii="Consolas" w:eastAsia="Times New Roman" w:hAnsi="Consolas" w:cs="Times New Roman"/>
+          <w:color w:val="0550AE"/>
+          <w:kern w:val="0"/>
+          <w:sz w:val="21"/>
+          <w:szCs w:val="21"/>
+          <w14:ligatures w14:val="none"/>
+        </w:rPr>
+        <w:t>actual</w:t>
+      </w:r>
+      <w:r>
+        <w:rPr>
+          <w:rFonts w:ascii="Consolas" w:eastAsia="Times New Roman" w:hAnsi="Consolas" w:cs="Times New Roman"/>
+          <w:color w:val="1F2328"/>
+          <w:kern w:val="0"/>
+          <w:sz w:val="21"/>
+          <w:szCs w:val="21"/>
+          <w14:ligatures w14:val="none"/>
+        </w:rPr>
+        <w:t>.characters).</w:t>
+      </w:r>
+      <w:r>
+        <w:rPr>
+          <w:rFonts w:ascii="Consolas" w:eastAsia="Times New Roman" w:hAnsi="Consolas" w:cs="Times New Roman"/>
+          <w:color w:val="8250DF"/>
+          <w:kern w:val="0"/>
+          <w:sz w:val="21"/>
+          <w:szCs w:val="21"/>
+          <w14:ligatures w14:val="none"/>
+        </w:rPr>
+        <w:t>toBeInstanceOf</w:t>
+      </w:r>
+      <w:proofErr w:type="gramEnd"/>
+      <w:r>
+        <w:rPr>
+          <w:rFonts w:ascii="Consolas" w:eastAsia="Times New Roman" w:hAnsi="Consolas" w:cs="Times New Roman"/>
+          <w:color w:val="1F2328"/>
+          <w:kern w:val="0"/>
+          <w:sz w:val="21"/>
+          <w:szCs w:val="21"/>
+          <w14:ligatures w14:val="none"/>
+        </w:rPr>
+        <w:t>(</w:t>
+      </w:r>
+      <w:r>
+        <w:rPr>
+          <w:rFonts w:ascii="Consolas" w:eastAsia="Times New Roman" w:hAnsi="Consolas" w:cs="Times New Roman"/>
+          <w:color w:val="267F99"/>
+          <w:kern w:val="0"/>
+          <w:sz w:val="21"/>
+          <w:szCs w:val="21"/>
+          <w14:ligatures w14:val="none"/>
+        </w:rPr>
+        <w:t>Array</w:t>
+      </w:r>
+      <w:r>
+        <w:rPr>
+          <w:rFonts w:ascii="Consolas" w:eastAsia="Times New Roman" w:hAnsi="Consolas" w:cs="Times New Roman"/>
+          <w:color w:val="1F2328"/>
+          <w:kern w:val="0"/>
+          <w:sz w:val="21"/>
+          <w:szCs w:val="21"/>
+          <w14:ligatures w14:val="none"/>
+        </w:rPr>
+        <w:t>)</w:t>
+      </w:r>
+    </w:p>
+    <w:p>
+      <w:pPr>
+        <w:shd w:val="clear" w:color="auto" w:fill="FFFFFF"/>
+        <w:spacing w:after="0" w:line="285" w:lineRule="atLeast"/>
+        <w:rPr>
+          <w:rFonts w:ascii="Consolas" w:eastAsia="Times New Roman" w:hAnsi="Consolas" w:cs="Times New Roman"/>
+          <w:color w:val="202020"/>
+          <w:kern w:val="0"/>
+          <w:sz w:val="21"/>
+          <w:szCs w:val="21"/>
+          <w14:ligatures w14:val="none"/>
+        </w:rPr>
+      </w:pPr>
+      <w:r>
+        <w:rPr>
+          <w:rFonts w:ascii="Consolas" w:eastAsia="Times New Roman" w:hAnsi="Consolas" w:cs="Times New Roman"/>
+          <w:color w:val="1F2328"/>
+          <w:kern w:val="0"/>
+          <w:sz w:val="21"/>
+          <w:szCs w:val="21"/>
+          <w14:ligatures w14:val="none"/>
+        </w:rPr>
+        <w:t xml:space="preserve">        </w:t>
+      </w:r>
+      <w:r>
+        <w:rPr>
+          <w:rFonts w:ascii="Consolas" w:eastAsia="Times New Roman" w:hAnsi="Consolas" w:cs="Times New Roman"/>
+          <w:color w:val="8250DF"/>
+          <w:kern w:val="0"/>
+          <w:sz w:val="21"/>
+          <w:szCs w:val="21"/>
+          <w14:ligatures w14:val="none"/>
+        </w:rPr>
+        <w:t>expect</w:t>
+      </w:r>
+      <w:r>
+        <w:rPr>
+          <w:rFonts w:ascii="Consolas" w:eastAsia="Times New Roman" w:hAnsi="Consolas" w:cs="Times New Roman"/>
+          <w:color w:val="1F2328"/>
+          <w:kern w:val="0"/>
+          <w:sz w:val="21"/>
+          <w:szCs w:val="21"/>
+          <w14:ligatures w14:val="none"/>
+        </w:rPr>
+        <w:t>(</w:t>
+      </w:r>
+      <w:proofErr w:type="gramStart"/>
+      <w:r>
+        <w:rPr>
+          <w:rFonts w:ascii="Consolas" w:eastAsia="Times New Roman" w:hAnsi="Consolas" w:cs="Times New Roman"/>
+          <w:color w:val="0550AE"/>
+          <w:kern w:val="0"/>
+          <w:sz w:val="21"/>
+          <w:szCs w:val="21"/>
+          <w14:ligatures w14:val="none"/>
+        </w:rPr>
+        <w:t>actual</w:t>
+      </w:r>
+      <w:r>
+        <w:rPr>
+          <w:rFonts w:ascii="Consolas" w:eastAsia="Times New Roman" w:hAnsi="Consolas" w:cs="Times New Roman"/>
+          <w:color w:val="1F2328"/>
+          <w:kern w:val="0"/>
+          <w:sz w:val="21"/>
+          <w:szCs w:val="21"/>
+          <w14:ligatures w14:val="none"/>
+        </w:rPr>
+        <w:t>.characters).</w:t>
+      </w:r>
+      <w:r>
+        <w:rPr>
+          <w:rFonts w:ascii="Consolas" w:eastAsia="Times New Roman" w:hAnsi="Consolas" w:cs="Times New Roman"/>
+          <w:color w:val="8250DF"/>
+          <w:kern w:val="0"/>
+          <w:sz w:val="21"/>
+          <w:szCs w:val="21"/>
+          <w14:ligatures w14:val="none"/>
+        </w:rPr>
+        <w:t>toEqual</w:t>
+      </w:r>
+      <w:proofErr w:type="gramEnd"/>
+      <w:r>
+        <w:rPr>
+          <w:rFonts w:ascii="Consolas" w:eastAsia="Times New Roman" w:hAnsi="Consolas" w:cs="Times New Roman"/>
+          <w:color w:val="1F2328"/>
+          <w:kern w:val="0"/>
+          <w:sz w:val="21"/>
+          <w:szCs w:val="21"/>
+          <w14:ligatures w14:val="none"/>
+        </w:rPr>
+        <w:t>([</w:t>
+      </w:r>
+      <w:r>
+        <w:rPr>
+          <w:rFonts w:ascii="Consolas" w:eastAsia="Times New Roman" w:hAnsi="Consolas" w:cs="Times New Roman"/>
+          <w:color w:val="000000"/>
+          <w:kern w:val="0"/>
+          <w:sz w:val="21"/>
+          <w:szCs w:val="21"/>
+          <w14:ligatures w14:val="none"/>
+        </w:rPr>
+        <w:t>...</w:t>
+      </w:r>
+      <w:r>
+        <w:rPr>
+          <w:rFonts w:ascii="Consolas" w:eastAsia="Times New Roman" w:hAnsi="Consolas" w:cs="Times New Roman"/>
+          <w:color w:val="0550AE"/>
+          <w:kern w:val="0"/>
+          <w:sz w:val="21"/>
+          <w:szCs w:val="21"/>
+          <w14:ligatures w14:val="none"/>
+        </w:rPr>
+        <w:t>testData</w:t>
+      </w:r>
+      <w:r>
+        <w:rPr>
+          <w:rFonts w:ascii="Consolas" w:eastAsia="Times New Roman" w:hAnsi="Consolas" w:cs="Times New Roman"/>
+          <w:color w:val="1F2328"/>
+          <w:kern w:val="0"/>
+          <w:sz w:val="21"/>
+          <w:szCs w:val="21"/>
+          <w14:ligatures w14:val="none"/>
+        </w:rPr>
+        <w:t>])</w:t>
+      </w:r>
+    </w:p>
+    <w:p>
+      <w:pPr>
+        <w:shd w:val="clear" w:color="auto" w:fill="FFFFFF"/>
+        <w:spacing w:after="0" w:line="285" w:lineRule="atLeast"/>
+        <w:rPr>
+          <w:rFonts w:ascii="Consolas" w:eastAsia="Times New Roman" w:hAnsi="Consolas" w:cs="Times New Roman"/>
+          <w:color w:val="202020"/>
+          <w:kern w:val="0"/>
+          <w:sz w:val="21"/>
+          <w:szCs w:val="21"/>
+          <w14:ligatures w14:val="none"/>
+        </w:rPr>
+      </w:pPr>
+      <w:r>
+        <w:rPr>
+          <w:rFonts w:ascii="Consolas" w:eastAsia="Times New Roman" w:hAnsi="Consolas" w:cs="Times New Roman"/>
+          <w:color w:val="1F2328"/>
+          <w:kern w:val="0"/>
+          <w:sz w:val="21"/>
+          <w:szCs w:val="21"/>
+          <w14:ligatures w14:val="none"/>
+        </w:rPr>
+        <w:t xml:space="preserve">        </w:t>
+      </w:r>
+      <w:r>
+        <w:rPr>
+          <w:rFonts w:ascii="Consolas" w:eastAsia="Times New Roman" w:hAnsi="Consolas" w:cs="Times New Roman"/>
+          <w:color w:val="8250DF"/>
+          <w:kern w:val="0"/>
+          <w:sz w:val="21"/>
+          <w:szCs w:val="21"/>
+          <w14:ligatures w14:val="none"/>
+        </w:rPr>
+        <w:t>expect</w:t>
+      </w:r>
+      <w:r>
+        <w:rPr>
+          <w:rFonts w:ascii="Consolas" w:eastAsia="Times New Roman" w:hAnsi="Consolas" w:cs="Times New Roman"/>
+          <w:color w:val="1F2328"/>
+          <w:kern w:val="0"/>
+          <w:sz w:val="21"/>
+          <w:szCs w:val="21"/>
+          <w14:ligatures w14:val="none"/>
+        </w:rPr>
+        <w:t>(</w:t>
+      </w:r>
+      <w:proofErr w:type="gramStart"/>
+      <w:r>
+        <w:rPr>
+          <w:rFonts w:ascii="Consolas" w:eastAsia="Times New Roman" w:hAnsi="Consolas" w:cs="Times New Roman"/>
+          <w:color w:val="0550AE"/>
+          <w:kern w:val="0"/>
+          <w:sz w:val="21"/>
+          <w:szCs w:val="21"/>
+          <w14:ligatures w14:val="none"/>
+        </w:rPr>
+        <w:t>actual</w:t>
+      </w:r>
+      <w:r>
+        <w:rPr>
+          <w:rFonts w:ascii="Consolas" w:eastAsia="Times New Roman" w:hAnsi="Consolas" w:cs="Times New Roman"/>
+          <w:color w:val="1F2328"/>
+          <w:kern w:val="0"/>
+          <w:sz w:val="21"/>
+          <w:szCs w:val="21"/>
+          <w14:ligatures w14:val="none"/>
+        </w:rPr>
+        <w:t>.characters).</w:t>
+      </w:r>
+      <w:r>
+        <w:rPr>
+          <w:rFonts w:ascii="Consolas" w:eastAsia="Times New Roman" w:hAnsi="Consolas" w:cs="Times New Roman"/>
+          <w:color w:val="8250DF"/>
+          <w:kern w:val="0"/>
+          <w:sz w:val="21"/>
+          <w:szCs w:val="21"/>
+          <w14:ligatures w14:val="none"/>
+        </w:rPr>
+        <w:t>toContainEqual</w:t>
+      </w:r>
+      <w:proofErr w:type="gramEnd"/>
+      <w:r>
+        <w:rPr>
+          <w:rFonts w:ascii="Consolas" w:eastAsia="Times New Roman" w:hAnsi="Consolas" w:cs="Times New Roman"/>
+          <w:color w:val="1F2328"/>
+          <w:kern w:val="0"/>
+          <w:sz w:val="21"/>
+          <w:szCs w:val="21"/>
+          <w14:ligatures w14:val="none"/>
+        </w:rPr>
+        <w:t>(</w:t>
+      </w:r>
+      <w:r>
+        <w:rPr>
+          <w:rFonts w:ascii="Consolas" w:eastAsia="Times New Roman" w:hAnsi="Consolas" w:cs="Times New Roman"/>
+          <w:color w:val="0A3069"/>
+          <w:kern w:val="0"/>
+          <w:sz w:val="21"/>
+          <w:szCs w:val="21"/>
+          <w14:ligatures w14:val="none"/>
+        </w:rPr>
+        <w:t>'J'</w:t>
+      </w:r>
+      <w:r>
+        <w:rPr>
+          <w:rFonts w:ascii="Consolas" w:eastAsia="Times New Roman" w:hAnsi="Consolas" w:cs="Times New Roman"/>
+          <w:color w:val="1F2328"/>
+          <w:kern w:val="0"/>
+          <w:sz w:val="21"/>
+          <w:szCs w:val="21"/>
+          <w14:ligatures w14:val="none"/>
+        </w:rPr>
+        <w:t>)</w:t>
+      </w:r>
+    </w:p>
+    <w:p>
+      <w:pPr>
+        <w:shd w:val="clear" w:color="auto" w:fill="FFFFFF"/>
+        <w:spacing w:after="0" w:line="285" w:lineRule="atLeast"/>
+        <w:rPr>
+          <w:rFonts w:ascii="Consolas" w:eastAsia="Times New Roman" w:hAnsi="Consolas" w:cs="Times New Roman"/>
+          <w:color w:val="202020"/>
+          <w:kern w:val="0"/>
+          <w:sz w:val="21"/>
+          <w:szCs w:val="21"/>
+          <w14:ligatures w14:val="none"/>
+        </w:rPr>
+      </w:pPr>
+      <w:r>
+        <w:rPr>
+          <w:rFonts w:ascii="Consolas" w:eastAsia="Times New Roman" w:hAnsi="Consolas" w:cs="Times New Roman"/>
+          <w:color w:val="1F2328"/>
+          <w:kern w:val="0"/>
+          <w:sz w:val="21"/>
+          <w:szCs w:val="21"/>
+          <w14:ligatures w14:val="none"/>
+        </w:rPr>
+        <w:t xml:space="preserve">        </w:t>
+      </w:r>
+      <w:r>
+        <w:rPr>
+          <w:rFonts w:ascii="Consolas" w:eastAsia="Times New Roman" w:hAnsi="Consolas" w:cs="Times New Roman"/>
+          <w:color w:val="8250DF"/>
+          <w:kern w:val="0"/>
+          <w:sz w:val="21"/>
+          <w:szCs w:val="21"/>
+          <w14:ligatures w14:val="none"/>
+        </w:rPr>
+        <w:t>expect</w:t>
+      </w:r>
+      <w:r>
+        <w:rPr>
+          <w:rFonts w:ascii="Consolas" w:eastAsia="Times New Roman" w:hAnsi="Consolas" w:cs="Times New Roman"/>
+          <w:color w:val="1F2328"/>
+          <w:kern w:val="0"/>
+          <w:sz w:val="21"/>
+          <w:szCs w:val="21"/>
+          <w14:ligatures w14:val="none"/>
+        </w:rPr>
+        <w:t>(</w:t>
+      </w:r>
+      <w:proofErr w:type="gramStart"/>
+      <w:r>
+        <w:rPr>
+          <w:rFonts w:ascii="Consolas" w:eastAsia="Times New Roman" w:hAnsi="Consolas" w:cs="Times New Roman"/>
+          <w:color w:val="0550AE"/>
+          <w:kern w:val="0"/>
+          <w:sz w:val="21"/>
+          <w:szCs w:val="21"/>
+          <w14:ligatures w14:val="none"/>
+        </w:rPr>
+        <w:t>actual</w:t>
+      </w:r>
+      <w:r>
+        <w:rPr>
+          <w:rFonts w:ascii="Consolas" w:eastAsia="Times New Roman" w:hAnsi="Consolas" w:cs="Times New Roman"/>
+          <w:color w:val="1F2328"/>
+          <w:kern w:val="0"/>
+          <w:sz w:val="21"/>
+          <w:szCs w:val="21"/>
+          <w14:ligatures w14:val="none"/>
+        </w:rPr>
+        <w:t>.extraInfo).</w:t>
+      </w:r>
+      <w:r>
+        <w:rPr>
+          <w:rFonts w:ascii="Consolas" w:eastAsia="Times New Roman" w:hAnsi="Consolas" w:cs="Times New Roman"/>
+          <w:color w:val="8250DF"/>
+          <w:kern w:val="0"/>
+          <w:sz w:val="21"/>
+          <w:szCs w:val="21"/>
+          <w14:ligatures w14:val="none"/>
+        </w:rPr>
+        <w:t>toMatchObject</w:t>
+      </w:r>
+      <w:proofErr w:type="gramEnd"/>
+      <w:r>
+        <w:rPr>
+          <w:rFonts w:ascii="Consolas" w:eastAsia="Times New Roman" w:hAnsi="Consolas" w:cs="Times New Roman"/>
+          <w:color w:val="1F2328"/>
+          <w:kern w:val="0"/>
+          <w:sz w:val="21"/>
+          <w:szCs w:val="21"/>
+          <w14:ligatures w14:val="none"/>
+        </w:rPr>
+        <w:t>({})</w:t>
+      </w:r>
+    </w:p>
+    <w:p>
+      <w:pPr>
+        <w:shd w:val="clear" w:color="auto" w:fill="FFFFFF"/>
+        <w:spacing w:after="0" w:line="285" w:lineRule="atLeast"/>
+        <w:rPr>
+          <w:rFonts w:ascii="Consolas" w:eastAsia="Times New Roman" w:hAnsi="Consolas" w:cs="Times New Roman"/>
+          <w:color w:val="202020"/>
+          <w:kern w:val="0"/>
+          <w:sz w:val="21"/>
+          <w:szCs w:val="21"/>
+          <w14:ligatures w14:val="none"/>
+        </w:rPr>
+      </w:pPr>
+      <w:r>
+        <w:rPr>
+          <w:rFonts w:ascii="Consolas" w:eastAsia="Times New Roman" w:hAnsi="Consolas" w:cs="Times New Roman"/>
+          <w:color w:val="1F2328"/>
+          <w:kern w:val="0"/>
+          <w:sz w:val="21"/>
+          <w:szCs w:val="21"/>
+          <w14:ligatures w14:val="none"/>
+        </w:rPr>
+        <w:t>    })</w:t>
+      </w:r>
+    </w:p>
+    <w:p>
+      <w:pPr>
+        <w:shd w:val="clear" w:color="auto" w:fill="FFFFFF"/>
+        <w:spacing w:after="0" w:line="285" w:lineRule="atLeast"/>
+        <w:rPr>
+          <w:rFonts w:ascii="Consolas" w:eastAsia="Times New Roman" w:hAnsi="Consolas" w:cs="Times New Roman"/>
+          <w:color w:val="202020"/>
+          <w:kern w:val="0"/>
+          <w:sz w:val="21"/>
+          <w:szCs w:val="21"/>
+          <w14:ligatures w14:val="none"/>
+        </w:rPr>
+      </w:pPr>
+      <w:r>
+        <w:rPr>
+          <w:rFonts w:ascii="Consolas" w:eastAsia="Times New Roman" w:hAnsi="Consolas" w:cs="Times New Roman"/>
+          <w:color w:val="1F2328"/>
+          <w:kern w:val="0"/>
+          <w:sz w:val="21"/>
+          <w:szCs w:val="21"/>
+          <w14:ligatures w14:val="none"/>
+        </w:rPr>
+        <w:t>}</w:t>
+      </w:r>
+      <w:r>
+        <w:rPr>
+          <w:rFonts w:ascii="Consolas" w:eastAsia="Times New Roman" w:hAnsi="Consolas" w:cs="Times New Roman"/>
+          <w:color w:val="202020"/>
+          <w:kern w:val="0"/>
+          <w:sz w:val="21"/>
+          <w:szCs w:val="21"/>
+          <w14:ligatures w14:val="none"/>
+        </w:rPr>
+        <w:t>)</w:t>
+      </w:r>
+    </w:p>
+    <w:p>
+      <w:pPr>
+        <w:shd w:val="clear" w:color="auto" w:fill="FFFFFF"/>
+        <w:spacing w:after="0" w:line="285" w:lineRule="atLeast"/>
+        <w:ind w:left="1440" w:firstLine="720"/>
+        <w:rPr>
+          <w:rFonts w:ascii="Consolas" w:eastAsia="Times New Roman" w:hAnsi="Consolas" w:cs="Times New Roman"/>
+          <w:color w:val="202020"/>
+          <w:kern w:val="0"/>
+          <w:sz w:val="21"/>
+          <w:szCs w:val="21"/>
+          <w14:ligatures w14:val="none"/>
+        </w:rPr>
       </w:pPr>
       <w:r>
         <w:rPr>
@@ -1637,39 +4323,8 @@
           <w:kern w:val="0"/>
           <w14:ligatures w14:val="none"/>
         </w:rPr>
-        <w:tab/>
-      </w:r>
-      <w:r>
-        <w:rPr>
-          <w:rFonts w:ascii="Sakkal Majalla" w:eastAsia="Times New Roman" w:hAnsi="Sakkal Majalla" w:cs="Sakkal Majalla" w:hint="cs"/>
-          <w:color w:val="202020"/>
-          <w:kern w:val="0"/>
-          <w14:ligatures w14:val="none"/>
-        </w:rPr>
-        <w:tab/>
-      </w:r>
-      <w:r>
-        <w:rPr>
-          <w:rFonts w:ascii="Sakkal Majalla" w:eastAsia="Times New Roman" w:hAnsi="Sakkal Majalla" w:cs="Sakkal Majalla" w:hint="cs"/>
-          <w:color w:val="202020"/>
-          <w:kern w:val="0"/>
-          <w14:ligatures w14:val="none"/>
-        </w:rPr>
-        <w:tab/>
         <w:t>====================================================</w:t>
       </w:r>
-    </w:p>
-    <w:p>
-      <w:pPr>
-        <w:shd w:val="clear" w:color="auto" w:fill="FFFFFF"/>
-        <w:spacing w:after="0" w:line="285" w:lineRule="atLeast"/>
-        <w:rPr>
-          <w:rFonts w:ascii="Sakkal Majalla" w:eastAsia="Times New Roman" w:hAnsi="Sakkal Majalla" w:cs="Sakkal Majalla" w:hint="cs"/>
-          <w:color w:val="202020"/>
-          <w:kern w:val="0"/>
-          <w14:ligatures w14:val="none"/>
-        </w:rPr>
-      </w:pPr>
     </w:p>
     <w:sectPr>
       <w:pgSz w:w="12240" w:h="15840"/>

</xml_diff>